<commit_message>
Completed till Section 4
</commit_message>
<xml_diff>
--- a/Final Report/SaiNeetiSayam-M00979693-24.04.2026-CST3990-FinalReport.docx
+++ b/Final Report/SaiNeetiSayam-M00979693-24.04.2026-CST3990-FinalReport.docx
@@ -282,13 +282,8 @@
         <w:t xml:space="preserve">. </w:t>
       </w:r>
       <w:r>
-        <w:t xml:space="preserve">Sumitra </w:t>
-      </w:r>
-      <w:proofErr w:type="spellStart"/>
-      <w:r>
-        <w:t>Kotipalli</w:t>
-      </w:r>
-      <w:proofErr w:type="spellEnd"/>
+        <w:t>Sumitra Kotipalli</w:t>
+      </w:r>
       <w:r>
         <w:t xml:space="preserve"> </w:t>
       </w:r>
@@ -870,6 +865,490 @@
         <w:spacing w:before="240"/>
         <w:jc w:val="both"/>
         <w:rPr>
+          <w:rFonts w:asciiTheme="minorBidi" w:hAnsiTheme="minorBidi" w:cstheme="minorBidi"/>
+          <w:color w:val="212A35"/>
+          <w:sz w:val="23"/>
+          <w:szCs w:val="23"/>
+        </w:rPr>
+      </w:pPr>
+      <w:r>
+        <w:rPr>
+          <w:sz w:val="23"/>
+          <w:szCs w:val="23"/>
+        </w:rPr>
+        <w:t xml:space="preserve">The report is divided into </w:t>
+      </w:r>
+      <w:r>
+        <w:rPr>
+          <w:b/>
+          <w:bCs/>
+          <w:color w:val="212A35"/>
+          <w:sz w:val="23"/>
+          <w:szCs w:val="23"/>
+        </w:rPr>
+        <w:t>ten</w:t>
+      </w:r>
+      <w:r>
+        <w:rPr>
+          <w:b/>
+          <w:bCs/>
+          <w:color w:val="212A35"/>
+          <w:sz w:val="23"/>
+          <w:szCs w:val="23"/>
+        </w:rPr>
+        <w:t xml:space="preserve"> </w:t>
+      </w:r>
+      <w:r>
+        <w:rPr>
+          <w:sz w:val="23"/>
+          <w:szCs w:val="23"/>
+        </w:rPr>
+        <w:t>sections</w:t>
+      </w:r>
+      <w:r>
+        <w:rPr>
+          <w:sz w:val="23"/>
+          <w:szCs w:val="23"/>
+        </w:rPr>
+        <w:t xml:space="preserve">. </w:t>
+      </w:r>
+      <w:r>
+        <w:rPr>
+          <w:rFonts w:asciiTheme="minorBidi" w:hAnsiTheme="minorBidi" w:cstheme="minorBidi"/>
+          <w:sz w:val="23"/>
+          <w:szCs w:val="23"/>
+        </w:rPr>
+        <w:t xml:space="preserve">The </w:t>
+      </w:r>
+      <w:r>
+        <w:rPr>
+          <w:rFonts w:asciiTheme="minorBidi" w:hAnsiTheme="minorBidi" w:cstheme="minorBidi"/>
+          <w:b/>
+          <w:bCs/>
+          <w:color w:val="212A35"/>
+          <w:sz w:val="23"/>
+          <w:szCs w:val="23"/>
+        </w:rPr>
+        <w:t xml:space="preserve">introduction </w:t>
+      </w:r>
+      <w:r>
+        <w:rPr>
+          <w:rFonts w:asciiTheme="minorBidi" w:hAnsiTheme="minorBidi" w:cstheme="minorBidi"/>
+          <w:sz w:val="23"/>
+          <w:szCs w:val="23"/>
+        </w:rPr>
+        <w:t xml:space="preserve">section talks about the need and scope of this application, where the </w:t>
+      </w:r>
+      <w:r>
+        <w:rPr>
+          <w:rFonts w:asciiTheme="minorBidi" w:hAnsiTheme="minorBidi" w:cstheme="minorBidi"/>
+          <w:b/>
+          <w:bCs/>
+          <w:color w:val="212A35"/>
+          <w:sz w:val="23"/>
+          <w:szCs w:val="23"/>
+        </w:rPr>
+        <w:t xml:space="preserve">background </w:t>
+      </w:r>
+      <w:r>
+        <w:rPr>
+          <w:rFonts w:asciiTheme="minorBidi" w:hAnsiTheme="minorBidi" w:cstheme="minorBidi"/>
+          <w:sz w:val="23"/>
+          <w:szCs w:val="23"/>
+        </w:rPr>
+        <w:t xml:space="preserve">section talks about the existing applications related to </w:t>
+      </w:r>
+      <w:r>
+        <w:rPr>
+          <w:rFonts w:asciiTheme="minorBidi" w:hAnsiTheme="minorBidi" w:cstheme="minorBidi"/>
+          <w:sz w:val="23"/>
+          <w:szCs w:val="23"/>
+        </w:rPr>
+        <w:t>cloud kitchens</w:t>
+      </w:r>
+      <w:r>
+        <w:rPr>
+          <w:rFonts w:asciiTheme="minorBidi" w:hAnsiTheme="minorBidi" w:cstheme="minorBidi"/>
+          <w:sz w:val="23"/>
+          <w:szCs w:val="23"/>
+        </w:rPr>
+        <w:t xml:space="preserve">. The </w:t>
+      </w:r>
+      <w:r>
+        <w:rPr>
+          <w:rFonts w:asciiTheme="minorBidi" w:hAnsiTheme="minorBidi" w:cstheme="minorBidi"/>
+          <w:b/>
+          <w:bCs/>
+          <w:color w:val="212A35"/>
+          <w:sz w:val="23"/>
+          <w:szCs w:val="23"/>
+        </w:rPr>
+        <w:t xml:space="preserve">requirements </w:t>
+      </w:r>
+      <w:r>
+        <w:rPr>
+          <w:rFonts w:asciiTheme="minorBidi" w:hAnsiTheme="minorBidi" w:cstheme="minorBidi"/>
+          <w:b/>
+          <w:bCs/>
+          <w:sz w:val="23"/>
+          <w:szCs w:val="23"/>
+        </w:rPr>
+        <w:t>gathering</w:t>
+      </w:r>
+      <w:r>
+        <w:rPr>
+          <w:rFonts w:asciiTheme="minorBidi" w:hAnsiTheme="minorBidi" w:cstheme="minorBidi"/>
+          <w:b/>
+          <w:bCs/>
+          <w:sz w:val="23"/>
+          <w:szCs w:val="23"/>
+        </w:rPr>
+        <w:t xml:space="preserve"> </w:t>
+      </w:r>
+      <w:r>
+        <w:rPr>
+          <w:rFonts w:asciiTheme="minorBidi" w:hAnsiTheme="minorBidi" w:cstheme="minorBidi"/>
+          <w:sz w:val="23"/>
+          <w:szCs w:val="23"/>
+        </w:rPr>
+        <w:t xml:space="preserve">section looks at the need of the users and displays list of functional and non-functional requirements, which then allow the </w:t>
+      </w:r>
+      <w:r>
+        <w:rPr>
+          <w:rFonts w:asciiTheme="minorBidi" w:hAnsiTheme="minorBidi" w:cstheme="minorBidi"/>
+          <w:b/>
+          <w:bCs/>
+          <w:color w:val="212A35"/>
+          <w:sz w:val="23"/>
+          <w:szCs w:val="23"/>
+        </w:rPr>
+        <w:t xml:space="preserve">requirements </w:t>
+      </w:r>
+      <w:r>
+        <w:rPr>
+          <w:rFonts w:asciiTheme="minorBidi" w:hAnsiTheme="minorBidi" w:cstheme="minorBidi"/>
+          <w:b/>
+          <w:bCs/>
+          <w:color w:val="212A35"/>
+          <w:sz w:val="23"/>
+          <w:szCs w:val="23"/>
+        </w:rPr>
+        <w:t>analysis</w:t>
+      </w:r>
+      <w:r>
+        <w:rPr>
+          <w:rFonts w:asciiTheme="minorBidi" w:hAnsiTheme="minorBidi" w:cstheme="minorBidi"/>
+          <w:color w:val="212A35"/>
+          <w:sz w:val="23"/>
+          <w:szCs w:val="23"/>
+        </w:rPr>
+        <w:t xml:space="preserve"> </w:t>
+      </w:r>
+      <w:r>
+        <w:rPr>
+          <w:rFonts w:asciiTheme="minorBidi" w:hAnsiTheme="minorBidi" w:cstheme="minorBidi"/>
+          <w:sz w:val="23"/>
+          <w:szCs w:val="23"/>
+        </w:rPr>
+        <w:t xml:space="preserve">to be carried out for the application. </w:t>
+      </w:r>
+      <w:r>
+        <w:rPr>
+          <w:rFonts w:asciiTheme="minorBidi" w:hAnsiTheme="minorBidi" w:cstheme="minorBidi"/>
+          <w:sz w:val="23"/>
+          <w:szCs w:val="23"/>
+        </w:rPr>
+        <w:t xml:space="preserve">The </w:t>
+      </w:r>
+      <w:r>
+        <w:rPr>
+          <w:rFonts w:asciiTheme="minorBidi" w:hAnsiTheme="minorBidi" w:cstheme="minorBidi"/>
+          <w:b/>
+          <w:bCs/>
+          <w:sz w:val="23"/>
+          <w:szCs w:val="23"/>
+        </w:rPr>
+        <w:t>planning</w:t>
+      </w:r>
+      <w:r>
+        <w:rPr>
+          <w:rFonts w:asciiTheme="minorBidi" w:hAnsiTheme="minorBidi" w:cstheme="minorBidi"/>
+          <w:sz w:val="23"/>
+          <w:szCs w:val="23"/>
+        </w:rPr>
+        <w:t xml:space="preserve"> phase consists of the </w:t>
+      </w:r>
+      <w:r>
+        <w:rPr>
+          <w:rFonts w:asciiTheme="minorBidi" w:hAnsiTheme="minorBidi" w:cstheme="minorBidi"/>
+          <w:sz w:val="23"/>
+          <w:szCs w:val="23"/>
+        </w:rPr>
+        <w:t xml:space="preserve">SDLC model chosen for the project and the </w:t>
+      </w:r>
+      <w:r>
+        <w:rPr>
+          <w:rFonts w:asciiTheme="minorBidi" w:hAnsiTheme="minorBidi" w:cstheme="minorBidi"/>
+          <w:sz w:val="23"/>
+          <w:szCs w:val="23"/>
+        </w:rPr>
+        <w:t xml:space="preserve">macro schedule and Gantt chart. </w:t>
+      </w:r>
+      <w:r>
+        <w:rPr>
+          <w:rFonts w:asciiTheme="minorBidi" w:hAnsiTheme="minorBidi" w:cstheme="minorBidi"/>
+          <w:sz w:val="23"/>
+          <w:szCs w:val="23"/>
+        </w:rPr>
+        <w:t xml:space="preserve">The </w:t>
+      </w:r>
+      <w:r>
+        <w:rPr>
+          <w:rFonts w:asciiTheme="minorBidi" w:hAnsiTheme="minorBidi" w:cstheme="minorBidi"/>
+          <w:b/>
+          <w:bCs/>
+          <w:color w:val="212A35"/>
+          <w:sz w:val="23"/>
+          <w:szCs w:val="23"/>
+        </w:rPr>
+        <w:t xml:space="preserve">design </w:t>
+      </w:r>
+      <w:r>
+        <w:rPr>
+          <w:rFonts w:asciiTheme="minorBidi" w:hAnsiTheme="minorBidi" w:cstheme="minorBidi"/>
+          <w:sz w:val="23"/>
+          <w:szCs w:val="23"/>
+        </w:rPr>
+        <w:t xml:space="preserve">phase consists of </w:t>
+      </w:r>
+      <w:r>
+        <w:rPr>
+          <w:rFonts w:asciiTheme="minorBidi" w:hAnsiTheme="minorBidi" w:cstheme="minorBidi"/>
+          <w:sz w:val="23"/>
+          <w:szCs w:val="23"/>
+        </w:rPr>
+        <w:t xml:space="preserve">ER diagrams, class diagrams and Use-Case diagrams that help to design and implement the solution. </w:t>
+      </w:r>
+      <w:r>
+        <w:rPr>
+          <w:rFonts w:asciiTheme="minorBidi" w:hAnsiTheme="minorBidi" w:cstheme="minorBidi"/>
+          <w:sz w:val="23"/>
+          <w:szCs w:val="23"/>
+        </w:rPr>
+        <w:t xml:space="preserve">The Design phase also describes the technology used in developing this application. </w:t>
+      </w:r>
+      <w:r>
+        <w:rPr>
+          <w:rFonts w:asciiTheme="minorBidi" w:hAnsiTheme="minorBidi" w:cstheme="minorBidi"/>
+          <w:b/>
+          <w:bCs/>
+          <w:color w:val="212A35"/>
+          <w:sz w:val="23"/>
+          <w:szCs w:val="23"/>
+        </w:rPr>
+        <w:t xml:space="preserve">Implementation </w:t>
+      </w:r>
+      <w:r>
+        <w:rPr>
+          <w:rFonts w:asciiTheme="minorBidi" w:hAnsiTheme="minorBidi" w:cstheme="minorBidi"/>
+          <w:sz w:val="23"/>
+          <w:szCs w:val="23"/>
+        </w:rPr>
+        <w:t xml:space="preserve">stage </w:t>
+      </w:r>
+      <w:r>
+        <w:rPr>
+          <w:rFonts w:asciiTheme="minorBidi" w:hAnsiTheme="minorBidi" w:cstheme="minorBidi"/>
+          <w:sz w:val="23"/>
+          <w:szCs w:val="23"/>
+        </w:rPr>
+        <w:t>describes</w:t>
+      </w:r>
+      <w:r>
+        <w:rPr>
+          <w:rFonts w:asciiTheme="minorBidi" w:hAnsiTheme="minorBidi" w:cstheme="minorBidi"/>
+          <w:sz w:val="23"/>
+          <w:szCs w:val="23"/>
+        </w:rPr>
+        <w:t xml:space="preserve"> the development phase. </w:t>
+      </w:r>
+      <w:r>
+        <w:rPr>
+          <w:rFonts w:asciiTheme="minorBidi" w:hAnsiTheme="minorBidi" w:cstheme="minorBidi"/>
+          <w:sz w:val="23"/>
+          <w:szCs w:val="23"/>
+        </w:rPr>
+        <w:t>T</w:t>
+      </w:r>
+      <w:r>
+        <w:rPr>
+          <w:rFonts w:asciiTheme="minorBidi" w:hAnsiTheme="minorBidi" w:cstheme="minorBidi"/>
+          <w:sz w:val="23"/>
+          <w:szCs w:val="23"/>
+        </w:rPr>
+        <w:t xml:space="preserve">he </w:t>
+      </w:r>
+      <w:r>
+        <w:rPr>
+          <w:rFonts w:asciiTheme="minorBidi" w:hAnsiTheme="minorBidi" w:cstheme="minorBidi"/>
+          <w:b/>
+          <w:bCs/>
+          <w:color w:val="212A35"/>
+          <w:sz w:val="23"/>
+          <w:szCs w:val="23"/>
+        </w:rPr>
+        <w:t xml:space="preserve">testing </w:t>
+      </w:r>
+      <w:r>
+        <w:rPr>
+          <w:rFonts w:asciiTheme="minorBidi" w:hAnsiTheme="minorBidi" w:cstheme="minorBidi"/>
+          <w:sz w:val="23"/>
+          <w:szCs w:val="23"/>
+        </w:rPr>
+        <w:t xml:space="preserve">section </w:t>
+      </w:r>
+      <w:r>
+        <w:rPr>
+          <w:rFonts w:asciiTheme="minorBidi" w:hAnsiTheme="minorBidi" w:cstheme="minorBidi"/>
+          <w:sz w:val="23"/>
+          <w:szCs w:val="23"/>
+        </w:rPr>
+        <w:t xml:space="preserve">details the test cases for testing the completed system. </w:t>
+      </w:r>
+      <w:r>
+        <w:rPr>
+          <w:rFonts w:asciiTheme="minorBidi" w:hAnsiTheme="minorBidi" w:cstheme="minorBidi"/>
+          <w:sz w:val="23"/>
+          <w:szCs w:val="23"/>
+        </w:rPr>
+        <w:t xml:space="preserve">The </w:t>
+      </w:r>
+      <w:r>
+        <w:rPr>
+          <w:rFonts w:asciiTheme="minorBidi" w:hAnsiTheme="minorBidi" w:cstheme="minorBidi"/>
+          <w:b/>
+          <w:bCs/>
+          <w:color w:val="212A35"/>
+          <w:sz w:val="23"/>
+          <w:szCs w:val="23"/>
+        </w:rPr>
+        <w:t xml:space="preserve">demonstration </w:t>
+      </w:r>
+      <w:r>
+        <w:rPr>
+          <w:rFonts w:asciiTheme="minorBidi" w:hAnsiTheme="minorBidi" w:cstheme="minorBidi"/>
+          <w:sz w:val="23"/>
+          <w:szCs w:val="23"/>
+        </w:rPr>
+        <w:t>section consists of screenshot</w:t>
+      </w:r>
+      <w:r>
+        <w:rPr>
+          <w:rFonts w:asciiTheme="minorBidi" w:hAnsiTheme="minorBidi" w:cstheme="minorBidi"/>
+          <w:sz w:val="23"/>
+          <w:szCs w:val="23"/>
+        </w:rPr>
+        <w:t>s</w:t>
+      </w:r>
+      <w:r>
+        <w:rPr>
+          <w:rFonts w:asciiTheme="minorBidi" w:hAnsiTheme="minorBidi" w:cstheme="minorBidi"/>
+          <w:sz w:val="23"/>
+          <w:szCs w:val="23"/>
+        </w:rPr>
+        <w:t xml:space="preserve"> of every screen to show how the application works</w:t>
+      </w:r>
+      <w:r>
+        <w:rPr>
+          <w:rFonts w:asciiTheme="minorBidi" w:hAnsiTheme="minorBidi" w:cstheme="minorBidi"/>
+          <w:sz w:val="23"/>
+          <w:szCs w:val="23"/>
+        </w:rPr>
+        <w:t>. In the e</w:t>
+      </w:r>
+      <w:r>
+        <w:rPr>
+          <w:rFonts w:asciiTheme="minorBidi" w:hAnsiTheme="minorBidi" w:cstheme="minorBidi"/>
+          <w:sz w:val="23"/>
+          <w:szCs w:val="23"/>
+        </w:rPr>
+        <w:t xml:space="preserve">nd, the </w:t>
+      </w:r>
+      <w:r>
+        <w:rPr>
+          <w:rFonts w:asciiTheme="minorBidi" w:hAnsiTheme="minorBidi" w:cstheme="minorBidi"/>
+          <w:b/>
+          <w:bCs/>
+          <w:color w:val="212A35"/>
+          <w:sz w:val="23"/>
+          <w:szCs w:val="23"/>
+        </w:rPr>
+        <w:t xml:space="preserve">conclusion </w:t>
+      </w:r>
+      <w:r>
+        <w:rPr>
+          <w:rFonts w:asciiTheme="minorBidi" w:hAnsiTheme="minorBidi" w:cstheme="minorBidi"/>
+          <w:color w:val="212A35"/>
+          <w:sz w:val="23"/>
+          <w:szCs w:val="23"/>
+        </w:rPr>
+        <w:t>section outlines the future enhancements made to this website to make it commercially usable.</w:t>
+      </w:r>
+      <w:r>
+        <w:rPr>
+          <w:rFonts w:asciiTheme="minorBidi" w:hAnsiTheme="minorBidi" w:cstheme="minorBidi"/>
+          <w:color w:val="212A35"/>
+          <w:sz w:val="23"/>
+          <w:szCs w:val="23"/>
+        </w:rPr>
+        <w:t xml:space="preserve"> The report is concluded with an </w:t>
+      </w:r>
+      <w:r>
+        <w:rPr>
+          <w:rFonts w:asciiTheme="minorBidi" w:hAnsiTheme="minorBidi" w:cstheme="minorBidi"/>
+          <w:b/>
+          <w:bCs/>
+          <w:color w:val="212A35"/>
+          <w:sz w:val="23"/>
+          <w:szCs w:val="23"/>
+        </w:rPr>
+        <w:t>appendix</w:t>
+      </w:r>
+      <w:r>
+        <w:rPr>
+          <w:rFonts w:asciiTheme="minorBidi" w:hAnsiTheme="minorBidi" w:cstheme="minorBidi"/>
+          <w:color w:val="212A35"/>
+          <w:sz w:val="23"/>
+          <w:szCs w:val="23"/>
+        </w:rPr>
+        <w:t xml:space="preserve"> that lists the references. </w:t>
+      </w:r>
+    </w:p>
+    <w:p>
+      <w:pPr>
+        <w:rPr>
+          <w:rFonts w:asciiTheme="minorBidi" w:hAnsiTheme="minorBidi"/>
+          <w:color w:val="212A35"/>
+          <w:sz w:val="23"/>
+          <w:szCs w:val="23"/>
+        </w:rPr>
+      </w:pPr>
+      <w:r>
+        <w:rPr>
+          <w:rFonts w:asciiTheme="minorBidi" w:hAnsiTheme="minorBidi"/>
+          <w:color w:val="212A35"/>
+          <w:sz w:val="23"/>
+          <w:szCs w:val="23"/>
+        </w:rPr>
+        <w:br w:type="page"/>
+      </w:r>
+    </w:p>
+    <w:p>
+      <w:pPr>
+        <w:pStyle w:val="Default"/>
+        <w:spacing w:before="240"/>
+        <w:jc w:val="both"/>
+        <w:rPr>
           <w:rFonts w:asciiTheme="minorBidi" w:eastAsiaTheme="majorEastAsia" w:hAnsiTheme="minorBidi" w:cstheme="minorBidi"/>
           <w:color w:val="0F4761" w:themeColor="accent1" w:themeShade="BF"/>
           <w:sz w:val="40"/>
@@ -877,445 +1356,11 @@
           <w:u w:val="single"/>
         </w:rPr>
       </w:pPr>
-      <w:r>
-        <w:rPr>
-          <w:sz w:val="23"/>
-          <w:szCs w:val="23"/>
-        </w:rPr>
-        <w:t xml:space="preserve">The report is divided into </w:t>
-      </w:r>
-      <w:r>
-        <w:rPr>
-          <w:b/>
-          <w:bCs/>
-          <w:color w:val="212A35"/>
-          <w:sz w:val="23"/>
-          <w:szCs w:val="23"/>
-        </w:rPr>
-        <w:t>ten</w:t>
-      </w:r>
-      <w:r>
-        <w:rPr>
-          <w:b/>
-          <w:bCs/>
-          <w:color w:val="212A35"/>
-          <w:sz w:val="23"/>
-          <w:szCs w:val="23"/>
-        </w:rPr>
-        <w:t xml:space="preserve"> </w:t>
-      </w:r>
-      <w:r>
-        <w:rPr>
-          <w:sz w:val="23"/>
-          <w:szCs w:val="23"/>
-        </w:rPr>
-        <w:t>sections</w:t>
-      </w:r>
-      <w:r>
-        <w:rPr>
-          <w:sz w:val="23"/>
-          <w:szCs w:val="23"/>
-        </w:rPr>
-        <w:t xml:space="preserve">. </w:t>
-      </w:r>
-      <w:r>
-        <w:rPr>
-          <w:rFonts w:asciiTheme="minorBidi" w:hAnsiTheme="minorBidi" w:cstheme="minorBidi"/>
-          <w:sz w:val="23"/>
-          <w:szCs w:val="23"/>
-        </w:rPr>
-        <w:t xml:space="preserve">The </w:t>
-      </w:r>
-      <w:r>
-        <w:rPr>
-          <w:rFonts w:asciiTheme="minorBidi" w:hAnsiTheme="minorBidi" w:cstheme="minorBidi"/>
-          <w:b/>
-          <w:bCs/>
-          <w:color w:val="212A35"/>
-          <w:sz w:val="23"/>
-          <w:szCs w:val="23"/>
-        </w:rPr>
-        <w:t xml:space="preserve">introduction </w:t>
-      </w:r>
-      <w:r>
-        <w:rPr>
-          <w:rFonts w:asciiTheme="minorBidi" w:hAnsiTheme="minorBidi" w:cstheme="minorBidi"/>
-          <w:sz w:val="23"/>
-          <w:szCs w:val="23"/>
-        </w:rPr>
-        <w:t xml:space="preserve">section talks about the need and scope of this application, where the </w:t>
-      </w:r>
-      <w:r>
-        <w:rPr>
-          <w:rFonts w:asciiTheme="minorBidi" w:hAnsiTheme="minorBidi" w:cstheme="minorBidi"/>
-          <w:b/>
-          <w:bCs/>
-          <w:color w:val="212A35"/>
-          <w:sz w:val="23"/>
-          <w:szCs w:val="23"/>
-        </w:rPr>
-        <w:t xml:space="preserve">background </w:t>
-      </w:r>
-      <w:r>
-        <w:rPr>
-          <w:rFonts w:asciiTheme="minorBidi" w:hAnsiTheme="minorBidi" w:cstheme="minorBidi"/>
-          <w:sz w:val="23"/>
-          <w:szCs w:val="23"/>
-        </w:rPr>
-        <w:t xml:space="preserve">section talks about the existing applications related to </w:t>
-      </w:r>
-      <w:r>
-        <w:rPr>
-          <w:rFonts w:asciiTheme="minorBidi" w:hAnsiTheme="minorBidi" w:cstheme="minorBidi"/>
-          <w:sz w:val="23"/>
-          <w:szCs w:val="23"/>
-        </w:rPr>
-        <w:t>cloud kitchens</w:t>
-      </w:r>
-      <w:r>
-        <w:rPr>
-          <w:rFonts w:asciiTheme="minorBidi" w:hAnsiTheme="minorBidi" w:cstheme="minorBidi"/>
-          <w:sz w:val="23"/>
-          <w:szCs w:val="23"/>
-        </w:rPr>
-        <w:t xml:space="preserve">. The </w:t>
-      </w:r>
-      <w:r>
-        <w:rPr>
-          <w:rFonts w:asciiTheme="minorBidi" w:hAnsiTheme="minorBidi" w:cstheme="minorBidi"/>
-          <w:b/>
-          <w:bCs/>
-          <w:color w:val="212A35"/>
-          <w:sz w:val="23"/>
-          <w:szCs w:val="23"/>
-        </w:rPr>
-        <w:t xml:space="preserve">requirements </w:t>
-      </w:r>
-      <w:r>
-        <w:rPr>
-          <w:rFonts w:asciiTheme="minorBidi" w:hAnsiTheme="minorBidi" w:cstheme="minorBidi"/>
-          <w:b/>
-          <w:bCs/>
-          <w:sz w:val="23"/>
-          <w:szCs w:val="23"/>
-        </w:rPr>
-        <w:t>gathering</w:t>
-      </w:r>
-      <w:r>
-        <w:rPr>
-          <w:rFonts w:asciiTheme="minorBidi" w:hAnsiTheme="minorBidi" w:cstheme="minorBidi"/>
-          <w:b/>
-          <w:bCs/>
-          <w:sz w:val="23"/>
-          <w:szCs w:val="23"/>
-        </w:rPr>
-        <w:t xml:space="preserve"> </w:t>
-      </w:r>
-      <w:r>
-        <w:rPr>
-          <w:rFonts w:asciiTheme="minorBidi" w:hAnsiTheme="minorBidi" w:cstheme="minorBidi"/>
-          <w:sz w:val="23"/>
-          <w:szCs w:val="23"/>
-        </w:rPr>
-        <w:t xml:space="preserve">section looks at the need of the users and displays list of functional and non-functional requirements, which then allow the </w:t>
-      </w:r>
-      <w:r>
-        <w:rPr>
-          <w:rFonts w:asciiTheme="minorBidi" w:hAnsiTheme="minorBidi" w:cstheme="minorBidi"/>
-          <w:b/>
-          <w:bCs/>
-          <w:color w:val="212A35"/>
-          <w:sz w:val="23"/>
-          <w:szCs w:val="23"/>
-        </w:rPr>
-        <w:t xml:space="preserve">requirements </w:t>
-      </w:r>
-      <w:r>
-        <w:rPr>
-          <w:rFonts w:asciiTheme="minorBidi" w:hAnsiTheme="minorBidi" w:cstheme="minorBidi"/>
-          <w:b/>
-          <w:bCs/>
-          <w:color w:val="212A35"/>
-          <w:sz w:val="23"/>
-          <w:szCs w:val="23"/>
-        </w:rPr>
-        <w:t>analysis</w:t>
-      </w:r>
-      <w:r>
-        <w:rPr>
-          <w:rFonts w:asciiTheme="minorBidi" w:hAnsiTheme="minorBidi" w:cstheme="minorBidi"/>
-          <w:color w:val="212A35"/>
-          <w:sz w:val="23"/>
-          <w:szCs w:val="23"/>
-        </w:rPr>
-        <w:t xml:space="preserve"> </w:t>
-      </w:r>
-      <w:r>
-        <w:rPr>
-          <w:rFonts w:asciiTheme="minorBidi" w:hAnsiTheme="minorBidi" w:cstheme="minorBidi"/>
-          <w:sz w:val="23"/>
-          <w:szCs w:val="23"/>
-        </w:rPr>
-        <w:t xml:space="preserve">to be carried out for the application. </w:t>
-      </w:r>
-      <w:r>
-        <w:rPr>
-          <w:rFonts w:asciiTheme="minorBidi" w:hAnsiTheme="minorBidi" w:cstheme="minorBidi"/>
-          <w:sz w:val="23"/>
-          <w:szCs w:val="23"/>
-        </w:rPr>
-        <w:t xml:space="preserve">The </w:t>
-      </w:r>
-      <w:r>
-        <w:rPr>
-          <w:rFonts w:asciiTheme="minorBidi" w:hAnsiTheme="minorBidi" w:cstheme="minorBidi"/>
-          <w:b/>
-          <w:bCs/>
-          <w:sz w:val="23"/>
-          <w:szCs w:val="23"/>
-        </w:rPr>
-        <w:t>planning</w:t>
-      </w:r>
-      <w:r>
-        <w:rPr>
-          <w:rFonts w:asciiTheme="minorBidi" w:hAnsiTheme="minorBidi" w:cstheme="minorBidi"/>
-          <w:sz w:val="23"/>
-          <w:szCs w:val="23"/>
-        </w:rPr>
-        <w:t xml:space="preserve"> phase consists of the macro schedule and Gantt chart. </w:t>
-      </w:r>
-      <w:r>
-        <w:rPr>
-          <w:rFonts w:asciiTheme="minorBidi" w:hAnsiTheme="minorBidi" w:cstheme="minorBidi"/>
-          <w:sz w:val="23"/>
-          <w:szCs w:val="23"/>
-        </w:rPr>
-        <w:t xml:space="preserve">The </w:t>
-      </w:r>
-      <w:r>
-        <w:rPr>
-          <w:rFonts w:asciiTheme="minorBidi" w:hAnsiTheme="minorBidi" w:cstheme="minorBidi"/>
-          <w:b/>
-          <w:bCs/>
-          <w:color w:val="212A35"/>
-          <w:sz w:val="23"/>
-          <w:szCs w:val="23"/>
-        </w:rPr>
-        <w:t xml:space="preserve">design </w:t>
-      </w:r>
-      <w:r>
-        <w:rPr>
-          <w:rFonts w:asciiTheme="minorBidi" w:hAnsiTheme="minorBidi" w:cstheme="minorBidi"/>
-          <w:sz w:val="23"/>
-          <w:szCs w:val="23"/>
-        </w:rPr>
-        <w:t xml:space="preserve">phase consists of </w:t>
-      </w:r>
-      <w:r>
-        <w:rPr>
-          <w:rFonts w:asciiTheme="minorBidi" w:hAnsiTheme="minorBidi" w:cstheme="minorBidi"/>
-          <w:sz w:val="23"/>
-          <w:szCs w:val="23"/>
-        </w:rPr>
-        <w:t xml:space="preserve">ER diagrams, class diagrams and Use-Case diagrams that help to design and implement the solution. </w:t>
-      </w:r>
-      <w:r>
-        <w:rPr>
-          <w:rFonts w:asciiTheme="minorBidi" w:hAnsiTheme="minorBidi" w:cstheme="minorBidi"/>
-          <w:sz w:val="23"/>
-          <w:szCs w:val="23"/>
-        </w:rPr>
-        <w:t xml:space="preserve">The Design phase also describes the technology used in developing this application. </w:t>
-      </w:r>
-      <w:r>
-        <w:rPr>
-          <w:rFonts w:asciiTheme="minorBidi" w:hAnsiTheme="minorBidi" w:cstheme="minorBidi"/>
-          <w:b/>
-          <w:bCs/>
-          <w:color w:val="212A35"/>
-          <w:sz w:val="23"/>
-          <w:szCs w:val="23"/>
-        </w:rPr>
-        <w:t xml:space="preserve">Implementation </w:t>
-      </w:r>
-      <w:r>
-        <w:rPr>
-          <w:rFonts w:asciiTheme="minorBidi" w:hAnsiTheme="minorBidi" w:cstheme="minorBidi"/>
-          <w:sz w:val="23"/>
-          <w:szCs w:val="23"/>
-        </w:rPr>
-        <w:t xml:space="preserve">stage </w:t>
-      </w:r>
-      <w:r>
-        <w:rPr>
-          <w:rFonts w:asciiTheme="minorBidi" w:hAnsiTheme="minorBidi" w:cstheme="minorBidi"/>
-          <w:sz w:val="23"/>
-          <w:szCs w:val="23"/>
-        </w:rPr>
-        <w:t>describes</w:t>
-      </w:r>
-      <w:r>
-        <w:rPr>
-          <w:rFonts w:asciiTheme="minorBidi" w:hAnsiTheme="minorBidi" w:cstheme="minorBidi"/>
-          <w:sz w:val="23"/>
-          <w:szCs w:val="23"/>
-        </w:rPr>
-        <w:t xml:space="preserve"> the development phase. </w:t>
-      </w:r>
-      <w:r>
-        <w:rPr>
-          <w:rFonts w:asciiTheme="minorBidi" w:hAnsiTheme="minorBidi" w:cstheme="minorBidi"/>
-          <w:sz w:val="23"/>
-          <w:szCs w:val="23"/>
-        </w:rPr>
-        <w:t>T</w:t>
-      </w:r>
-      <w:r>
-        <w:rPr>
-          <w:rFonts w:asciiTheme="minorBidi" w:hAnsiTheme="minorBidi" w:cstheme="minorBidi"/>
-          <w:sz w:val="23"/>
-          <w:szCs w:val="23"/>
-        </w:rPr>
-        <w:t xml:space="preserve">he </w:t>
-      </w:r>
-      <w:r>
-        <w:rPr>
-          <w:rFonts w:asciiTheme="minorBidi" w:hAnsiTheme="minorBidi" w:cstheme="minorBidi"/>
-          <w:b/>
-          <w:bCs/>
-          <w:color w:val="212A35"/>
-          <w:sz w:val="23"/>
-          <w:szCs w:val="23"/>
-        </w:rPr>
-        <w:t xml:space="preserve">testing </w:t>
-      </w:r>
-      <w:r>
-        <w:rPr>
-          <w:rFonts w:asciiTheme="minorBidi" w:hAnsiTheme="minorBidi" w:cstheme="minorBidi"/>
-          <w:sz w:val="23"/>
-          <w:szCs w:val="23"/>
-        </w:rPr>
-        <w:t xml:space="preserve">section </w:t>
-      </w:r>
-      <w:r>
-        <w:rPr>
-          <w:rFonts w:asciiTheme="minorBidi" w:hAnsiTheme="minorBidi" w:cstheme="minorBidi"/>
-          <w:sz w:val="23"/>
-          <w:szCs w:val="23"/>
-        </w:rPr>
-        <w:t xml:space="preserve">details the test cases for testing the completed system. </w:t>
-      </w:r>
-      <w:r>
-        <w:rPr>
-          <w:rFonts w:asciiTheme="minorBidi" w:hAnsiTheme="minorBidi" w:cstheme="minorBidi"/>
-          <w:sz w:val="23"/>
-          <w:szCs w:val="23"/>
-        </w:rPr>
-        <w:t xml:space="preserve">The </w:t>
-      </w:r>
-      <w:r>
-        <w:rPr>
-          <w:rFonts w:asciiTheme="minorBidi" w:hAnsiTheme="minorBidi" w:cstheme="minorBidi"/>
-          <w:b/>
-          <w:bCs/>
-          <w:color w:val="212A35"/>
-          <w:sz w:val="23"/>
-          <w:szCs w:val="23"/>
-        </w:rPr>
-        <w:t xml:space="preserve">demonstration </w:t>
-      </w:r>
-      <w:r>
-        <w:rPr>
-          <w:rFonts w:asciiTheme="minorBidi" w:hAnsiTheme="minorBidi" w:cstheme="minorBidi"/>
-          <w:sz w:val="23"/>
-          <w:szCs w:val="23"/>
-        </w:rPr>
-        <w:t>section consists of screenshot</w:t>
-      </w:r>
-      <w:r>
-        <w:rPr>
-          <w:rFonts w:asciiTheme="minorBidi" w:hAnsiTheme="minorBidi" w:cstheme="minorBidi"/>
-          <w:sz w:val="23"/>
-          <w:szCs w:val="23"/>
-        </w:rPr>
-        <w:t>s</w:t>
-      </w:r>
-      <w:r>
-        <w:rPr>
-          <w:rFonts w:asciiTheme="minorBidi" w:hAnsiTheme="minorBidi" w:cstheme="minorBidi"/>
-          <w:sz w:val="23"/>
-          <w:szCs w:val="23"/>
-        </w:rPr>
-        <w:t xml:space="preserve"> of every screen to show how the application works</w:t>
-      </w:r>
-      <w:r>
-        <w:rPr>
-          <w:rFonts w:asciiTheme="minorBidi" w:hAnsiTheme="minorBidi" w:cstheme="minorBidi"/>
-          <w:sz w:val="23"/>
-          <w:szCs w:val="23"/>
-        </w:rPr>
-        <w:t>. In the e</w:t>
-      </w:r>
-      <w:r>
-        <w:rPr>
-          <w:rFonts w:asciiTheme="minorBidi" w:hAnsiTheme="minorBidi" w:cstheme="minorBidi"/>
-          <w:sz w:val="23"/>
-          <w:szCs w:val="23"/>
-        </w:rPr>
-        <w:t xml:space="preserve">nd, the </w:t>
-      </w:r>
-      <w:r>
-        <w:rPr>
-          <w:rFonts w:asciiTheme="minorBidi" w:hAnsiTheme="minorBidi" w:cstheme="minorBidi"/>
-          <w:b/>
-          <w:bCs/>
-          <w:color w:val="212A35"/>
-          <w:sz w:val="23"/>
-          <w:szCs w:val="23"/>
-        </w:rPr>
-        <w:t xml:space="preserve">conclusion </w:t>
-      </w:r>
-      <w:r>
-        <w:rPr>
-          <w:rFonts w:asciiTheme="minorBidi" w:hAnsiTheme="minorBidi" w:cstheme="minorBidi"/>
-          <w:color w:val="212A35"/>
-          <w:sz w:val="23"/>
-          <w:szCs w:val="23"/>
-        </w:rPr>
-        <w:t>section outlines the future enhancements made to this website to make it commercially usable.</w:t>
-      </w:r>
-      <w:r>
-        <w:rPr>
-          <w:rFonts w:asciiTheme="minorBidi" w:hAnsiTheme="minorBidi" w:cstheme="minorBidi"/>
-          <w:color w:val="212A35"/>
-          <w:sz w:val="23"/>
-          <w:szCs w:val="23"/>
-        </w:rPr>
-        <w:t xml:space="preserve"> The report is concluded with an </w:t>
-      </w:r>
-      <w:r>
-        <w:rPr>
-          <w:rFonts w:asciiTheme="minorBidi" w:hAnsiTheme="minorBidi" w:cstheme="minorBidi"/>
-          <w:b/>
-          <w:bCs/>
-          <w:color w:val="212A35"/>
-          <w:sz w:val="23"/>
-          <w:szCs w:val="23"/>
-        </w:rPr>
-        <w:t>appendix</w:t>
-      </w:r>
-      <w:r>
-        <w:rPr>
-          <w:rFonts w:asciiTheme="minorBidi" w:hAnsiTheme="minorBidi" w:cstheme="minorBidi"/>
-          <w:color w:val="212A35"/>
-          <w:sz w:val="23"/>
-          <w:szCs w:val="23"/>
-        </w:rPr>
-        <w:t xml:space="preserve"> that lists the references. </w:t>
-      </w:r>
-    </w:p>
-    <w:p>
-      <w:pPr>
+    </w:p>
+    <w:p>
+      <w:pPr>
+        <w:pStyle w:val="Default"/>
+        <w:jc w:val="center"/>
         <w:rPr>
           <w:rFonts w:asciiTheme="majorHAnsi" w:eastAsiaTheme="majorEastAsia" w:hAnsiTheme="majorHAnsi" w:cstheme="majorBidi"/>
           <w:color w:val="0F4761" w:themeColor="accent1" w:themeShade="BF"/>
@@ -1324,7 +1369,11 @@
           <w:u w:val="single"/>
         </w:rPr>
       </w:pPr>
-      <w:r>
+    </w:p>
+    <w:p>
+      <w:pPr>
+        <w:pStyle w:val="Default"/>
+        <w:jc w:val="center"/>
         <w:rPr>
           <w:rFonts w:asciiTheme="majorHAnsi" w:eastAsiaTheme="majorEastAsia" w:hAnsiTheme="majorHAnsi" w:cstheme="majorBidi"/>
           <w:color w:val="0F4761" w:themeColor="accent1" w:themeShade="BF"/>
@@ -1332,11 +1381,223 @@
           <w:szCs w:val="40"/>
           <w:u w:val="single"/>
         </w:rPr>
-        <w:br w:type="page"/>
-      </w:r>
-    </w:p>
-    <w:p>
-      <w:pPr>
+      </w:pPr>
+    </w:p>
+    <w:p>
+      <w:pPr>
+        <w:pStyle w:val="Default"/>
+        <w:jc w:val="center"/>
+        <w:rPr>
+          <w:rFonts w:ascii="Times New Roman" w:hAnsi="Times New Roman" w:cs="Times New Roman"/>
+          <w:b/>
+          <w:bCs/>
+          <w:sz w:val="40"/>
+          <w:szCs w:val="40"/>
+        </w:rPr>
+      </w:pPr>
+      <w:r>
+        <w:rPr>
+          <w:rFonts w:ascii="Times New Roman" w:hAnsi="Times New Roman" w:cs="Times New Roman"/>
+          <w:b/>
+          <w:bCs/>
+          <w:sz w:val="40"/>
+          <w:szCs w:val="40"/>
+        </w:rPr>
+        <w:t>Acknowledgement</w:t>
+      </w:r>
+    </w:p>
+    <w:p>
+      <w:pPr>
+        <w:pStyle w:val="Default"/>
+        <w:jc w:val="center"/>
+        <w:rPr>
+          <w:rFonts w:ascii="Times New Roman" w:hAnsi="Times New Roman" w:cs="Times New Roman"/>
+          <w:b/>
+          <w:bCs/>
+          <w:sz w:val="40"/>
+          <w:szCs w:val="40"/>
+        </w:rPr>
+      </w:pPr>
+    </w:p>
+    <w:p>
+      <w:pPr>
+        <w:pStyle w:val="Default"/>
+        <w:jc w:val="center"/>
+        <w:rPr>
+          <w:rFonts w:ascii="Times New Roman" w:hAnsi="Times New Roman" w:cs="Times New Roman"/>
+          <w:sz w:val="40"/>
+          <w:szCs w:val="40"/>
+        </w:rPr>
+      </w:pPr>
+    </w:p>
+    <w:p>
+      <w:pPr>
+        <w:autoSpaceDE w:val="0"/>
+        <w:autoSpaceDN w:val="0"/>
+        <w:adjustRightInd w:val="0"/>
+        <w:spacing w:after="0" w:line="240" w:lineRule="auto"/>
+        <w:jc w:val="center"/>
+        <w:rPr>
+          <w:rFonts w:ascii="Times New Roman" w:hAnsi="Times New Roman" w:cs="Times New Roman"/>
+          <w:color w:val="000000"/>
+          <w:sz w:val="28"/>
+          <w:szCs w:val="28"/>
+        </w:rPr>
+      </w:pPr>
+      <w:r>
+        <w:rPr>
+          <w:rFonts w:ascii="Times New Roman" w:hAnsi="Times New Roman" w:cs="Times New Roman"/>
+          <w:color w:val="000000"/>
+          <w:sz w:val="28"/>
+          <w:szCs w:val="28"/>
+        </w:rPr>
+        <w:t xml:space="preserve">I would like to sincerely thank </w:t>
+      </w:r>
+      <w:r>
+        <w:rPr>
+          <w:rFonts w:ascii="Times New Roman" w:hAnsi="Times New Roman" w:cs="Times New Roman"/>
+          <w:color w:val="000000"/>
+          <w:sz w:val="28"/>
+          <w:szCs w:val="28"/>
+        </w:rPr>
+        <w:t>Prof</w:t>
+      </w:r>
+      <w:r>
+        <w:rPr>
+          <w:rFonts w:ascii="Times New Roman" w:hAnsi="Times New Roman" w:cs="Times New Roman"/>
+          <w:color w:val="000000"/>
+          <w:sz w:val="28"/>
+          <w:szCs w:val="28"/>
+        </w:rPr>
+        <w:t xml:space="preserve">. </w:t>
+      </w:r>
+      <w:r>
+        <w:rPr>
+          <w:rFonts w:ascii="Times New Roman" w:hAnsi="Times New Roman" w:cs="Times New Roman"/>
+          <w:color w:val="000000"/>
+          <w:sz w:val="28"/>
+          <w:szCs w:val="28"/>
+        </w:rPr>
+        <w:t>Sumitra Kotipalli</w:t>
+      </w:r>
+      <w:r>
+        <w:rPr>
+          <w:rFonts w:ascii="Times New Roman" w:hAnsi="Times New Roman" w:cs="Times New Roman"/>
+          <w:color w:val="000000"/>
+          <w:sz w:val="28"/>
+          <w:szCs w:val="28"/>
+        </w:rPr>
+        <w:t xml:space="preserve"> and </w:t>
+      </w:r>
+      <w:r>
+        <w:rPr>
+          <w:rFonts w:ascii="Times New Roman" w:hAnsi="Times New Roman" w:cs="Times New Roman"/>
+          <w:color w:val="000000"/>
+          <w:sz w:val="28"/>
+          <w:szCs w:val="28"/>
+        </w:rPr>
+        <w:t>Prof. Chinnu Mary George</w:t>
+      </w:r>
+      <w:r>
+        <w:rPr>
+          <w:rFonts w:ascii="Times New Roman" w:hAnsi="Times New Roman" w:cs="Times New Roman"/>
+          <w:color w:val="000000"/>
+          <w:sz w:val="28"/>
+          <w:szCs w:val="28"/>
+        </w:rPr>
+        <w:t xml:space="preserve"> for their excellent </w:t>
+      </w:r>
+      <w:r>
+        <w:rPr>
+          <w:rFonts w:ascii="Times New Roman" w:hAnsi="Times New Roman" w:cs="Times New Roman"/>
+          <w:color w:val="000000"/>
+          <w:sz w:val="28"/>
+          <w:szCs w:val="28"/>
+        </w:rPr>
+        <w:t>guidance</w:t>
+      </w:r>
+      <w:r>
+        <w:rPr>
+          <w:rFonts w:ascii="Times New Roman" w:hAnsi="Times New Roman" w:cs="Times New Roman"/>
+          <w:color w:val="000000"/>
+          <w:sz w:val="28"/>
+          <w:szCs w:val="28"/>
+        </w:rPr>
+        <w:t xml:space="preserve">, support, and insightful feedback during the </w:t>
+      </w:r>
+      <w:r>
+        <w:rPr>
+          <w:rFonts w:ascii="Times New Roman" w:hAnsi="Times New Roman" w:cs="Times New Roman"/>
+          <w:color w:val="000000"/>
+          <w:sz w:val="28"/>
+          <w:szCs w:val="28"/>
+        </w:rPr>
+        <w:t>project planning, design and implementation.</w:t>
+      </w:r>
+      <w:r>
+        <w:rPr>
+          <w:rFonts w:ascii="Times New Roman" w:hAnsi="Times New Roman" w:cs="Times New Roman"/>
+          <w:color w:val="000000"/>
+          <w:sz w:val="28"/>
+          <w:szCs w:val="28"/>
+        </w:rPr>
+        <w:t xml:space="preserve"> Their knowledge and support </w:t>
+      </w:r>
+      <w:r>
+        <w:rPr>
+          <w:rFonts w:ascii="Times New Roman" w:hAnsi="Times New Roman" w:cs="Times New Roman"/>
+          <w:color w:val="000000"/>
+          <w:sz w:val="28"/>
+          <w:szCs w:val="28"/>
+        </w:rPr>
+        <w:t>has</w:t>
+      </w:r>
+      <w:r>
+        <w:rPr>
+          <w:rFonts w:ascii="Times New Roman" w:hAnsi="Times New Roman" w:cs="Times New Roman"/>
+          <w:color w:val="000000"/>
+          <w:sz w:val="28"/>
+          <w:szCs w:val="28"/>
+        </w:rPr>
+        <w:t xml:space="preserve"> been crucial in </w:t>
+      </w:r>
+      <w:r>
+        <w:rPr>
+          <w:rFonts w:ascii="Times New Roman" w:hAnsi="Times New Roman" w:cs="Times New Roman"/>
+          <w:color w:val="000000"/>
+          <w:sz w:val="28"/>
+          <w:szCs w:val="28"/>
+        </w:rPr>
+        <w:t>successful completion of this project</w:t>
+      </w:r>
+      <w:r>
+        <w:rPr>
+          <w:rFonts w:ascii="Times New Roman" w:hAnsi="Times New Roman" w:cs="Times New Roman"/>
+          <w:color w:val="000000"/>
+          <w:sz w:val="28"/>
+          <w:szCs w:val="28"/>
+        </w:rPr>
+        <w:t>.</w:t>
+      </w:r>
+    </w:p>
+    <w:p>
+      <w:pPr>
+        <w:autoSpaceDE w:val="0"/>
+        <w:autoSpaceDN w:val="0"/>
+        <w:adjustRightInd w:val="0"/>
+        <w:spacing w:after="0" w:line="240" w:lineRule="auto"/>
+        <w:jc w:val="center"/>
+        <w:rPr>
+          <w:rFonts w:ascii="Times New Roman" w:hAnsi="Times New Roman" w:cs="Times New Roman"/>
+          <w:color w:val="000000"/>
+          <w:sz w:val="28"/>
+          <w:szCs w:val="28"/>
+        </w:rPr>
+      </w:pPr>
+    </w:p>
+    <w:p>
+      <w:pPr>
+        <w:jc w:val="center"/>
         <w:rPr>
           <w:rFonts w:asciiTheme="majorHAnsi" w:eastAsiaTheme="majorEastAsia" w:hAnsiTheme="majorHAnsi" w:cstheme="majorBidi"/>
           <w:color w:val="0F4761" w:themeColor="accent1" w:themeShade="BF"/>
@@ -1345,12 +1606,61 @@
           <w:u w:val="single"/>
         </w:rPr>
       </w:pPr>
+      <w:r>
+        <w:rPr>
+          <w:rFonts w:ascii="Times New Roman" w:hAnsi="Times New Roman" w:cs="Times New Roman"/>
+          <w:color w:val="000000"/>
+          <w:sz w:val="28"/>
+          <w:szCs w:val="28"/>
+        </w:rPr>
+        <w:t xml:space="preserve">I also want to express my sincere gratitude to my family and friends for their constant backing, understanding, and encouragement. Their patience and confidence in me </w:t>
+      </w:r>
+      <w:r>
+        <w:rPr>
+          <w:rFonts w:ascii="Times New Roman" w:hAnsi="Times New Roman" w:cs="Times New Roman"/>
+          <w:color w:val="000000"/>
+          <w:sz w:val="28"/>
+          <w:szCs w:val="28"/>
+        </w:rPr>
+        <w:t>has</w:t>
+      </w:r>
+      <w:r>
+        <w:rPr>
+          <w:rFonts w:ascii="Times New Roman" w:hAnsi="Times New Roman" w:cs="Times New Roman"/>
+          <w:color w:val="000000"/>
+          <w:sz w:val="28"/>
+          <w:szCs w:val="28"/>
+        </w:rPr>
+        <w:t xml:space="preserve"> been an ongoing source of support during this process.</w:t>
+      </w:r>
+    </w:p>
+    <w:p>
+      <w:pPr>
+        <w:rPr>
+          <w:rFonts w:asciiTheme="majorHAnsi" w:eastAsiaTheme="majorEastAsia" w:hAnsiTheme="majorHAnsi" w:cstheme="majorBidi"/>
+          <w:color w:val="0F4761" w:themeColor="accent1" w:themeShade="BF"/>
+          <w:sz w:val="40"/>
+          <w:szCs w:val="40"/>
+          <w:u w:val="single"/>
+        </w:rPr>
+      </w:pPr>
+      <w:r>
+        <w:rPr>
+          <w:rFonts w:asciiTheme="majorHAnsi" w:eastAsiaTheme="majorEastAsia" w:hAnsiTheme="majorHAnsi" w:cstheme="majorBidi"/>
+          <w:color w:val="0F4761" w:themeColor="accent1" w:themeShade="BF"/>
+          <w:sz w:val="40"/>
+          <w:szCs w:val="40"/>
+          <w:u w:val="single"/>
+        </w:rPr>
+        <w:br w:type="page"/>
+      </w:r>
     </w:p>
     <w:p>
       <w:pPr>
         <w:pStyle w:val="Heading1"/>
       </w:pPr>
       <w:r>
+        <w:lastRenderedPageBreak/>
         <w:t>Introduction</w:t>
       </w:r>
     </w:p>
@@ -1540,19 +1850,11 @@
         </w:rPr>
         <w:t xml:space="preserve">As per </w:t>
       </w:r>
-      <w:proofErr w:type="spellStart"/>
       <w:r>
         <w:rPr>
           <w:lang w:val="en-US"/>
         </w:rPr>
-        <w:t>Marmore</w:t>
-      </w:r>
-      <w:proofErr w:type="spellEnd"/>
-      <w:r>
-        <w:rPr>
-          <w:lang w:val="en-US"/>
-        </w:rPr>
-        <w:t xml:space="preserve"> MENA</w:t>
+        <w:t>Marmore MENA</w:t>
       </w:r>
       <w:r>
         <w:rPr>
@@ -1636,6 +1938,7 @@
     </w:p>
     <w:p>
       <w:pPr>
+        <w:jc w:val="both"/>
         <w:rPr>
           <w:lang w:val="en-US"/>
         </w:rPr>
@@ -1644,35 +1947,13 @@
         <w:rPr>
           <w:lang w:val="en-US"/>
         </w:rPr>
-        <w:t xml:space="preserve">As quoted by </w:t>
-      </w:r>
-      <w:proofErr w:type="spellStart"/>
-      <w:r>
-        <w:rPr>
-          <w:lang w:val="en-US"/>
-        </w:rPr>
-        <w:t>Marmore</w:t>
-      </w:r>
-      <w:proofErr w:type="spellEnd"/>
-      <w:r>
-        <w:rPr>
-          <w:lang w:val="en-US"/>
-        </w:rPr>
-        <w:t xml:space="preserve"> MENA, “</w:t>
+        <w:t>As quoted by Marmore MENA, “</w:t>
       </w:r>
       <w:r>
         <w:t>w</w:t>
       </w:r>
       <w:r>
-        <w:t xml:space="preserve">ith the increased penetration of dark kitchens following the COVID pandemic, the UAE online food delivery market is predicted to develop at a CAGR of 23%, based on the research from business consulting company </w:t>
-      </w:r>
-      <w:proofErr w:type="spellStart"/>
-      <w:r>
-        <w:t>RedSeer</w:t>
-      </w:r>
-      <w:proofErr w:type="spellEnd"/>
-      <w:r>
-        <w:t>, with over 400 brands and more than 80 locations in the </w:t>
+        <w:t>ith the increased penetration of dark kitchens following the COVID pandemic, the UAE online food delivery market is predicted to develop at a CAGR of 23%, based on the research from business consulting company RedSeer, with over 400 brands and more than 80 locations in the </w:t>
       </w:r>
       <w:hyperlink r:id="rId12" w:tgtFrame="_blank" w:history="1">
         <w:r>
@@ -1734,9 +2015,10 @@
         <w:pStyle w:val="Heading2"/>
       </w:pPr>
       <w:r>
-        <w:t>Concept of Cloud Kitchen</w:t>
-      </w:r>
-    </w:p>
+        <w:t>Literature Review</w:t>
+      </w:r>
+    </w:p>
+    <w:p/>
     <w:p>
       <w:pPr>
         <w:jc w:val="center"/>
@@ -1861,21 +2143,23 @@
           <w:u w:val="single"/>
         </w:rPr>
       </w:pPr>
-      <w:r>
+    </w:p>
+    <w:p>
+      <w:pPr>
+        <w:jc w:val="both"/>
         <w:rPr>
           <w:b/>
           <w:bCs/>
           <w:u w:val="single"/>
         </w:rPr>
-        <w:t>Key Points</w:t>
-      </w:r>
+      </w:pPr>
       <w:r>
         <w:rPr>
           <w:b/>
           <w:bCs/>
           <w:u w:val="single"/>
         </w:rPr>
-        <w:t xml:space="preserve"> on Cloud Kitchens</w:t>
+        <w:t>Key Points</w:t>
       </w:r>
       <w:r>
         <w:rPr>
@@ -1883,6 +2167,14 @@
           <w:bCs/>
           <w:u w:val="single"/>
         </w:rPr>
+        <w:t xml:space="preserve"> on Cloud Kitchens</w:t>
+      </w:r>
+      <w:r>
+        <w:rPr>
+          <w:b/>
+          <w:bCs/>
+          <w:u w:val="single"/>
+        </w:rPr>
         <w:t xml:space="preserve">: </w:t>
       </w:r>
     </w:p>
@@ -1897,7 +2189,6 @@
         <w:rPr>
           <w:lang w:val="en-US"/>
         </w:rPr>
-        <w:lastRenderedPageBreak/>
         <w:t>How does a cloud kitchen work?</w:t>
       </w:r>
     </w:p>
@@ -1914,15 +2205,7 @@
         </w:rPr>
       </w:pPr>
       <w:r>
-        <w:t xml:space="preserve">Customers place orders through apps like Uber Eats, </w:t>
-      </w:r>
-      <w:proofErr w:type="spellStart"/>
-      <w:r>
-        <w:t>Talabat</w:t>
-      </w:r>
-      <w:proofErr w:type="spellEnd"/>
-      <w:r>
-        <w:t>, or Zomato.</w:t>
+        <w:t>Customers place orders through apps like Uber Eats, Talabat, or Zomato.</w:t>
       </w:r>
     </w:p>
     <w:p>
@@ -2079,6 +2362,14 @@
           <w:lang w:val="en-US"/>
         </w:rPr>
       </w:pPr>
+    </w:p>
+    <w:p>
+      <w:pPr>
+        <w:spacing w:after="0"/>
+        <w:rPr>
+          <w:lang w:val="en-US"/>
+        </w:rPr>
+      </w:pPr>
       <w:r>
         <w:rPr>
           <w:lang w:val="en-US"/>
@@ -2154,6 +2445,11 @@
       <w:pPr>
         <w:spacing w:after="0"/>
       </w:pPr>
+    </w:p>
+    <w:p>
+      <w:pPr>
+        <w:spacing w:after="0"/>
+      </w:pPr>
       <w:r>
         <w:t xml:space="preserve">To put altogether, a cloud kitchen is a </w:t>
       </w:r>
@@ -2170,68 +2466,30 @@
         <w:t>mainly</w:t>
       </w:r>
       <w:r>
+        <w:t xml:space="preserve"> depends </w:t>
+      </w:r>
+      <w:r>
+        <w:t xml:space="preserve"> on </w:t>
+      </w:r>
+      <w:r>
+        <w:t>food delivery apps</w:t>
+      </w:r>
+      <w:r>
+        <w:t>/websites</w:t>
+      </w:r>
+      <w:r>
+        <w:t xml:space="preserve"> instead of having a physical dining space.</w:t>
+      </w:r>
+      <w:r>
         <w:t xml:space="preserve"> </w:t>
       </w:r>
-      <w:proofErr w:type="gramStart"/>
-      <w:r>
-        <w:t xml:space="preserve">depends </w:t>
-      </w:r>
-      <w:r>
-        <w:t xml:space="preserve"> on</w:t>
-      </w:r>
-      <w:proofErr w:type="gramEnd"/>
-      <w:r>
-        <w:t xml:space="preserve"> </w:t>
-      </w:r>
-      <w:r>
-        <w:t>food delivery apps</w:t>
-      </w:r>
-      <w:r>
-        <w:t>/websites</w:t>
-      </w:r>
-      <w:r>
-        <w:t xml:space="preserve"> instead of having a physical dining space.</w:t>
-      </w:r>
-      <w:r>
-        <w:t xml:space="preserve"> </w:t>
-      </w:r>
-    </w:p>
-    <w:p>
-      <w:pPr>
-        <w:rPr>
-          <w:b/>
-          <w:bCs/>
-        </w:rPr>
-      </w:pPr>
-      <w:r>
-        <w:rPr>
-          <w:b/>
-          <w:bCs/>
-        </w:rPr>
-        <w:br w:type="page"/>
-      </w:r>
-    </w:p>
-    <w:p>
-      <w:pPr>
-        <w:pStyle w:val="Heading1"/>
-      </w:pPr>
-      <w:r>
-        <w:lastRenderedPageBreak/>
-        <w:t>Requirements Gathering</w:t>
-      </w:r>
     </w:p>
     <w:p>
       <w:pPr>
         <w:spacing w:after="0"/>
       </w:pPr>
       <w:r>
-        <w:t xml:space="preserve">Cloud kitchen management software plays a vital role in handling online orders, managing inventory, tracking deliveries, and </w:t>
-      </w:r>
-      <w:r>
-        <w:t>analysing</w:t>
-      </w:r>
-      <w:r>
-        <w:t xml:space="preserve"> customer preferences. However, despite its growing adoption in the food service industry, existing cloud kitchen software systems still face several limitations that hinder operational efficiency and business growth. </w:t>
+        <w:t xml:space="preserve">Cloud kitchen management software plays a vital role in handling online orders, managing inventory, tracking deliveries, and analysing customer preferences. However, despite its growing adoption in the food service industry, existing cloud kitchen software systems still face several limitations that hinder operational efficiency and business growth. </w:t>
       </w:r>
     </w:p>
     <w:p>
@@ -2266,7 +2524,7 @@
           <w:noProof/>
         </w:rPr>
         <w:drawing>
-          <wp:inline distT="0" distB="0" distL="0" distR="0" wp14:anchorId="03609580" wp14:editId="364F4878">
+          <wp:inline distT="0" distB="0" distL="0" distR="0" wp14:anchorId="7644F8FD" wp14:editId="4F10F214">
             <wp:extent cx="4129796" cy="2428646"/>
             <wp:effectExtent l="0" t="0" r="4445" b="0"/>
             <wp:docPr id="1010602165" name="Picture 1" descr="Discover the top 5 inventory challenges for cloud kitchens and how to solve them to reduce waste, improve control, and boost your profit margins."/>
@@ -2347,6 +2605,7 @@
           <w:szCs w:val="20"/>
           <w:lang w:val="en-US"/>
         </w:rPr>
+        <w:lastRenderedPageBreak/>
         <w:t>Fig 2</w:t>
       </w:r>
     </w:p>
@@ -2397,13 +2656,7 @@
         <w:t xml:space="preserve">Solution: </w:t>
       </w:r>
       <w:r>
-        <w:t xml:space="preserve">Invest in an inventory management software designed specifically for the F&amp;B industry. Real-time dashboards give your team an accurate view of stock levels anytime, anywhere. Real-time data also means you can respond quickly to unexpected spikes in </w:t>
-      </w:r>
-      <w:r>
-        <w:t>demand like</w:t>
-      </w:r>
-      <w:r>
-        <w:t xml:space="preserve"> sudden festival orders without panic purchasing. </w:t>
+        <w:t xml:space="preserve">Invest in an inventory management software designed specifically for the F&amp;B industry. Real-time dashboards give your team an accurate view of stock levels anytime, anywhere. Real-time data also means you can respond quickly to unexpected spikes in demand like sudden festival orders without panic purchasing. </w:t>
       </w:r>
     </w:p>
     <w:p>
@@ -2466,7 +2719,6 @@
         <w:spacing w:after="0"/>
       </w:pPr>
       <w:r>
-        <w:lastRenderedPageBreak/>
         <w:t>Integrate inventory software with sales to predict usage and auto-generate purchase orders.</w:t>
       </w:r>
     </w:p>
@@ -2594,6 +2846,7 @@
         <w:spacing w:after="0"/>
       </w:pPr>
       <w:r>
+        <w:lastRenderedPageBreak/>
         <w:t>Introduce barcode or QR scanning to speed up and standardise data entry.</w:t>
       </w:r>
     </w:p>
@@ -2614,16 +2867,7 @@
         <w:t xml:space="preserve">Automation not only saves hours every week but also provides accurate data for monthly audits and </w:t>
       </w:r>
       <w:r>
-        <w:t>p</w:t>
-      </w:r>
-      <w:r>
-        <w:t>rofit</w:t>
-      </w:r>
-      <w:r>
-        <w:t xml:space="preserve"> and l</w:t>
-      </w:r>
-      <w:r>
-        <w:t>oss</w:t>
+        <w:t>profit and loss</w:t>
       </w:r>
       <w:r>
         <w:t xml:space="preserve"> analysis. </w:t>
@@ -2688,6 +2932,34 @@
     </w:p>
     <w:p>
       <w:pPr>
+        <w:rPr>
+          <w:b/>
+          <w:bCs/>
+        </w:rPr>
+      </w:pPr>
+      <w:r>
+        <w:rPr>
+          <w:b/>
+          <w:bCs/>
+        </w:rPr>
+        <w:br w:type="page"/>
+      </w:r>
+    </w:p>
+    <w:p>
+      <w:pPr>
+        <w:pStyle w:val="Heading1"/>
+      </w:pPr>
+      <w:r>
+        <w:lastRenderedPageBreak/>
+        <w:t xml:space="preserve">Requirements </w:t>
+      </w:r>
+      <w:r>
+        <w:t>Specification</w:t>
+      </w:r>
+    </w:p>
+    <w:p/>
+    <w:p>
+      <w:pPr>
         <w:pStyle w:val="Heading2"/>
       </w:pPr>
       <w:r>
@@ -2728,7 +3000,6 @@
     </w:p>
     <w:p>
       <w:r>
-        <w:lastRenderedPageBreak/>
         <w:t>M</w:t>
       </w:r>
       <w:r>
@@ -3241,6 +3512,7 @@
                 <w:b/>
                 <w:bCs/>
               </w:rPr>
+              <w:lastRenderedPageBreak/>
               <w:t>#9</w:t>
             </w:r>
           </w:p>
@@ -3382,7 +3654,6 @@
                 <w:b/>
                 <w:bCs/>
               </w:rPr>
-              <w:lastRenderedPageBreak/>
               <w:t>#13</w:t>
             </w:r>
           </w:p>
@@ -3648,15 +3919,7 @@
           </w:tcPr>
           <w:p>
             <w:r>
-              <w:t xml:space="preserve">The </w:t>
-            </w:r>
-            <w:proofErr w:type="gramStart"/>
-            <w:r>
-              <w:t>Admin</w:t>
-            </w:r>
-            <w:proofErr w:type="gramEnd"/>
-            <w:r>
-              <w:t xml:space="preserve"> portal shall have restricted access.  </w:t>
+              <w:t xml:space="preserve">The Admin portal shall have restricted access.  </w:t>
             </w:r>
           </w:p>
         </w:tc>
@@ -3989,15 +4252,7 @@
         <w:t>functional requirement</w:t>
       </w:r>
       <w:r>
-        <w:t xml:space="preserve"> into a software requirement </w:t>
-      </w:r>
-      <w:proofErr w:type="gramStart"/>
-      <w:r>
-        <w:t>in order to</w:t>
-      </w:r>
-      <w:proofErr w:type="gramEnd"/>
-      <w:r>
-        <w:t xml:space="preserve"> facilitate the design and development </w:t>
+        <w:t xml:space="preserve"> into a software requirement in order to facilitate the design and development </w:t>
       </w:r>
       <w:r>
         <w:t>e</w:t>
@@ -4066,7 +4321,14 @@
                 <w:b/>
                 <w:bCs/>
               </w:rPr>
-              <w:t>Customer Requirements</w:t>
+              <w:t>Business</w:t>
+            </w:r>
+            <w:r>
+              <w:rPr>
+                <w:b/>
+                <w:bCs/>
+              </w:rPr>
+              <w:t xml:space="preserve"> Requirements</w:t>
             </w:r>
           </w:p>
         </w:tc>
@@ -4211,15 +4473,7 @@
               <w:spacing w:after="200" w:line="288" w:lineRule="auto"/>
             </w:pPr>
             <w:r>
-              <w:t xml:space="preserve">The frontend of the </w:t>
-            </w:r>
-            <w:proofErr w:type="gramStart"/>
-            <w:r>
-              <w:t>Admin</w:t>
-            </w:r>
-            <w:proofErr w:type="gramEnd"/>
-            <w:r>
-              <w:t xml:space="preserve"> portal shall allow logging in with a password. This portal shall only be used by the Cloud Kitchen staff. </w:t>
+              <w:t xml:space="preserve">The frontend of the Admin portal shall allow logging in with a password. This portal shall only be used by the Cloud Kitchen staff. </w:t>
             </w:r>
           </w:p>
         </w:tc>
@@ -4335,15 +4589,7 @@
               </w:numPr>
             </w:pPr>
             <w:r>
-              <w:t xml:space="preserve">In the </w:t>
-            </w:r>
-            <w:proofErr w:type="gramStart"/>
-            <w:r>
-              <w:t>modern day</w:t>
-            </w:r>
-            <w:proofErr w:type="gramEnd"/>
-            <w:r>
-              <w:t xml:space="preserve"> kitchens, the raw material required to prepare a dish are stored as separate units. By doing so, it becomes easy to have control over the stock for each dish and take corrective action as soon as the kitchen is running low with the stock of a particular dish. </w:t>
+              <w:t xml:space="preserve">In the modern day kitchens, the raw material required to prepare a dish are stored as separate units. By doing so, it becomes easy to have control over the stock for each dish and take corrective action as soon as the kitchen is running low with the stock of a particular dish. </w:t>
             </w:r>
           </w:p>
           <w:p>
@@ -4601,15 +4847,7 @@
               </w:numPr>
             </w:pPr>
             <w:r>
-              <w:t xml:space="preserve">There may be few instances when a dish needs to be removed from the menu. The system shall allow the </w:t>
-            </w:r>
-            <w:proofErr w:type="gramStart"/>
-            <w:r>
-              <w:t>Admin</w:t>
-            </w:r>
-            <w:proofErr w:type="gramEnd"/>
-            <w:r>
-              <w:t xml:space="preserve"> staff to delete a dish from the menu.</w:t>
+              <w:t>There may be few instances when a dish needs to be removed from the menu. The system shall allow the Admin staff to delete a dish from the menu.</w:t>
             </w:r>
           </w:p>
         </w:tc>
@@ -4726,15 +4964,7 @@
               </w:numPr>
             </w:pPr>
             <w:r>
-              <w:t xml:space="preserve">The </w:t>
-            </w:r>
-            <w:proofErr w:type="gramStart"/>
-            <w:r>
-              <w:t>Admin</w:t>
-            </w:r>
-            <w:proofErr w:type="gramEnd"/>
-            <w:r>
-              <w:t xml:space="preserve"> portal shall display all dishes in cloud kitchen along with their respective stock available within their kitchen.</w:t>
+              <w:t>The Admin portal shall display all dishes in cloud kitchen along with their respective stock available within their kitchen.</w:t>
             </w:r>
           </w:p>
         </w:tc>
@@ -4890,15 +5120,7 @@
               </w:numPr>
             </w:pPr>
             <w:r>
-              <w:t xml:space="preserve">When the stock available for a dish reaches zero, the system shall not allow customers to </w:t>
-            </w:r>
-            <w:proofErr w:type="gramStart"/>
-            <w:r>
-              <w:t>make a selection</w:t>
-            </w:r>
-            <w:proofErr w:type="gramEnd"/>
-            <w:r>
-              <w:t xml:space="preserve"> and add that dish to the cart.</w:t>
+              <w:t>When the stock available for a dish reaches zero, the system shall not allow customers to make a selection and add that dish to the cart.</w:t>
             </w:r>
           </w:p>
         </w:tc>
@@ -5095,13 +5317,857 @@
       </w:r>
     </w:p>
     <w:p>
+      <w:r>
+        <w:br w:type="page"/>
+      </w:r>
+    </w:p>
+    <w:p/>
+    <w:p>
       <w:pPr>
         <w:pStyle w:val="Heading1"/>
         <w:ind w:left="432"/>
       </w:pPr>
       <w:r>
+        <w:t>Project Plan and Schedule</w:t>
+      </w:r>
+    </w:p>
+    <w:p>
+      <w:r>
+        <w:t xml:space="preserve">This section details </w:t>
+      </w:r>
+      <w:r>
+        <w:t xml:space="preserve">the most important phase of the project namely the design of the project and determining the major milestone of the project. The critical factor in planning for any project is to establish the software development model to be used based on its suitability for the project. </w:t>
+      </w:r>
+    </w:p>
+    <w:p>
+      <w:pPr>
+        <w:pStyle w:val="Heading2"/>
+      </w:pPr>
+      <w:r>
+        <w:t>Software Development Life Cycle (SDLC)</w:t>
+      </w:r>
+    </w:p>
+    <w:p>
+      <w:r>
+        <w:t xml:space="preserve">Since this is a short project to be completed in about two months, a hybrid approach containing the traditional </w:t>
+      </w:r>
+      <w:r>
+        <w:t>W</w:t>
+      </w:r>
+      <w:r>
+        <w:t xml:space="preserve">aterfall model and the </w:t>
+      </w:r>
+      <w:r>
+        <w:t>A</w:t>
+      </w:r>
+      <w:r>
+        <w:t>gile model has been adopted</w:t>
+      </w:r>
+      <w:r>
+        <w:t xml:space="preserve">. Here is brief on both these models, which help in establishing the basis of choosing a hybrid model. </w:t>
+      </w:r>
+    </w:p>
+    <w:p>
+      <w:r>
+        <w:t xml:space="preserve">SDLC is </w:t>
+      </w:r>
+      <w:r>
+        <w:t>a structured process used in Software Engineering to design, develop, test, and deploy software efficiently and reliably.</w:t>
+      </w:r>
+      <w:r>
+        <w:t xml:space="preserve"> The key phases of SDLC are listed below. </w:t>
+      </w:r>
+    </w:p>
+    <w:p>
+      <w:pPr>
+        <w:pStyle w:val="ListParagraph"/>
+        <w:numPr>
+          <w:ilvl w:val="0"/>
+          <w:numId w:val="51"/>
+        </w:numPr>
+        <w:spacing w:after="0"/>
+        <w:rPr>
+          <w:b/>
+          <w:bCs/>
+        </w:rPr>
+      </w:pPr>
+      <w:r>
+        <w:rPr>
+          <w:b/>
+          <w:bCs/>
+        </w:rPr>
+        <w:t>Planning</w:t>
+      </w:r>
+    </w:p>
+    <w:p>
+      <w:pPr>
+        <w:spacing w:after="0"/>
+        <w:ind w:left="720"/>
+      </w:pPr>
+      <w:r>
+        <w:t>Define project goals, scope, and feasibility.</w:t>
+      </w:r>
+    </w:p>
+    <w:p>
+      <w:pPr>
+        <w:spacing w:after="0"/>
+        <w:ind w:left="720"/>
+      </w:pPr>
+      <w:r>
+        <w:t>Identify resources, timeline, and risks.</w:t>
+      </w:r>
+    </w:p>
+    <w:p>
+      <w:pPr>
+        <w:pStyle w:val="ListParagraph"/>
+        <w:numPr>
+          <w:ilvl w:val="0"/>
+          <w:numId w:val="51"/>
+        </w:numPr>
+        <w:spacing w:after="0"/>
+        <w:rPr>
+          <w:b/>
+          <w:bCs/>
+        </w:rPr>
+      </w:pPr>
+      <w:r>
+        <w:rPr>
+          <w:b/>
+          <w:bCs/>
+        </w:rPr>
+        <w:t>Requirements Analysis</w:t>
+      </w:r>
+    </w:p>
+    <w:p>
+      <w:pPr>
+        <w:spacing w:after="0"/>
+        <w:ind w:left="720"/>
+      </w:pPr>
+      <w:r>
+        <w:t>Gather and document what users need.</w:t>
+      </w:r>
+    </w:p>
+    <w:p>
+      <w:pPr>
+        <w:spacing w:after="0"/>
+        <w:ind w:left="720"/>
+      </w:pPr>
+      <w:r>
+        <w:t>Create clear functional and non-functional requirements.</w:t>
+      </w:r>
+    </w:p>
+    <w:p>
+      <w:pPr>
+        <w:pStyle w:val="ListParagraph"/>
+        <w:numPr>
+          <w:ilvl w:val="0"/>
+          <w:numId w:val="51"/>
+        </w:numPr>
+        <w:spacing w:after="0"/>
+        <w:rPr>
+          <w:b/>
+          <w:bCs/>
+        </w:rPr>
+      </w:pPr>
+      <w:r>
+        <w:rPr>
+          <w:b/>
+          <w:bCs/>
+        </w:rPr>
+        <w:t>Design</w:t>
+      </w:r>
+    </w:p>
+    <w:p>
+      <w:pPr>
+        <w:spacing w:after="0"/>
+        <w:ind w:left="720"/>
+      </w:pPr>
+      <w:r>
+        <w:t>Plan the system architecture, database, and interfaces.</w:t>
+      </w:r>
+    </w:p>
+    <w:p>
+      <w:pPr>
+        <w:spacing w:after="0"/>
+        <w:ind w:left="720"/>
+      </w:pPr>
+      <w:r>
+        <w:t>Decide how the software will work internally.</w:t>
+      </w:r>
+    </w:p>
+    <w:p>
+      <w:pPr>
+        <w:pStyle w:val="ListParagraph"/>
+        <w:numPr>
+          <w:ilvl w:val="0"/>
+          <w:numId w:val="51"/>
+        </w:numPr>
+        <w:spacing w:after="0"/>
+        <w:rPr>
+          <w:b/>
+          <w:bCs/>
+        </w:rPr>
+      </w:pPr>
+      <w:r>
+        <w:rPr>
+          <w:b/>
+          <w:bCs/>
+        </w:rPr>
+        <w:t>Development (Coding)</w:t>
+      </w:r>
+    </w:p>
+    <w:p>
+      <w:pPr>
+        <w:spacing w:after="0"/>
+        <w:ind w:left="720"/>
+      </w:pPr>
+      <w:r>
+        <w:t>Programmers write the actual code.</w:t>
+      </w:r>
+    </w:p>
+    <w:p>
+      <w:pPr>
+        <w:spacing w:after="0"/>
+        <w:ind w:left="720"/>
+      </w:pPr>
+      <w:r>
+        <w:t>This is where the product is built.</w:t>
+      </w:r>
+    </w:p>
+    <w:p>
+      <w:pPr>
+        <w:pStyle w:val="ListParagraph"/>
+        <w:numPr>
+          <w:ilvl w:val="0"/>
+          <w:numId w:val="51"/>
+        </w:numPr>
+        <w:spacing w:after="0"/>
+        <w:rPr>
+          <w:b/>
+          <w:bCs/>
+        </w:rPr>
+      </w:pPr>
+      <w:r>
+        <w:rPr>
+          <w:b/>
+          <w:bCs/>
+        </w:rPr>
+        <w:t>Testing</w:t>
+      </w:r>
+    </w:p>
+    <w:p>
+      <w:pPr>
+        <w:spacing w:after="0"/>
+        <w:ind w:left="720"/>
+      </w:pPr>
+      <w:r>
+        <w:t>Check for bugs, errors, and performance issues.</w:t>
+      </w:r>
+    </w:p>
+    <w:p>
+      <w:pPr>
+        <w:spacing w:after="0"/>
+        <w:ind w:left="720"/>
+      </w:pPr>
+      <w:r>
+        <w:t>Ensure the software meets requirements.</w:t>
+      </w:r>
+    </w:p>
+    <w:p>
+      <w:pPr>
+        <w:pStyle w:val="ListParagraph"/>
+        <w:numPr>
+          <w:ilvl w:val="0"/>
+          <w:numId w:val="51"/>
+        </w:numPr>
+        <w:spacing w:after="0"/>
+        <w:rPr>
+          <w:b/>
+          <w:bCs/>
+        </w:rPr>
+      </w:pPr>
+      <w:r>
+        <w:rPr>
+          <w:b/>
+          <w:bCs/>
+        </w:rPr>
+        <w:t>Deployment</w:t>
+      </w:r>
+    </w:p>
+    <w:p>
+      <w:pPr>
+        <w:spacing w:after="0"/>
+        <w:ind w:left="720"/>
+      </w:pPr>
+      <w:r>
+        <w:t>Release the software to users or production environment.</w:t>
+      </w:r>
+    </w:p>
+    <w:p>
+      <w:pPr>
+        <w:pStyle w:val="ListParagraph"/>
+        <w:numPr>
+          <w:ilvl w:val="0"/>
+          <w:numId w:val="51"/>
+        </w:numPr>
+        <w:spacing w:after="0"/>
+        <w:rPr>
+          <w:b/>
+          <w:bCs/>
+        </w:rPr>
+      </w:pPr>
+      <w:r>
+        <w:rPr>
+          <w:b/>
+          <w:bCs/>
+        </w:rPr>
+        <w:t>Maintenance</w:t>
+      </w:r>
+    </w:p>
+    <w:p>
+      <w:pPr>
+        <w:spacing w:after="0"/>
+        <w:ind w:left="720"/>
+      </w:pPr>
+      <w:r>
+        <w:t>Fix bugs, update features, and improve performance over time.</w:t>
+      </w:r>
+    </w:p>
+    <w:p>
+      <w:pPr>
+        <w:spacing w:after="0"/>
+      </w:pPr>
+    </w:p>
+    <w:p>
+      <w:pPr>
+        <w:spacing w:after="0"/>
+      </w:pPr>
+      <w:r>
+        <w:t>The most popular SDLC Models are:</w:t>
+      </w:r>
+    </w:p>
+    <w:p>
+      <w:pPr>
+        <w:pStyle w:val="ListParagraph"/>
+        <w:numPr>
+          <w:ilvl w:val="0"/>
+          <w:numId w:val="47"/>
+        </w:numPr>
+        <w:spacing w:after="0"/>
+      </w:pPr>
+      <w:r>
+        <w:t>Waterfall Model – linear and sequential</w:t>
+      </w:r>
+    </w:p>
+    <w:p>
+      <w:pPr>
+        <w:pStyle w:val="ListParagraph"/>
+        <w:numPr>
+          <w:ilvl w:val="0"/>
+          <w:numId w:val="47"/>
+        </w:numPr>
+        <w:spacing w:after="0"/>
+      </w:pPr>
+      <w:r>
+        <w:t>Agile Model – iterative and flexible</w:t>
+      </w:r>
+    </w:p>
+    <w:p>
+      <w:pPr>
+        <w:pStyle w:val="ListParagraph"/>
+        <w:numPr>
+          <w:ilvl w:val="0"/>
+          <w:numId w:val="47"/>
+        </w:numPr>
+        <w:spacing w:after="0"/>
+      </w:pPr>
+      <w:r>
+        <w:t>Spiral Model – risk-driven approach</w:t>
+      </w:r>
+    </w:p>
+    <w:p>
+      <w:pPr>
+        <w:pStyle w:val="ListParagraph"/>
+        <w:numPr>
+          <w:ilvl w:val="0"/>
+          <w:numId w:val="47"/>
+        </w:numPr>
+        <w:spacing w:after="0"/>
+      </w:pPr>
+      <w:r>
+        <w:t>V-Model – emphasizes testing at each stage</w:t>
+      </w:r>
+    </w:p>
+    <w:p>
+      <w:pPr>
+        <w:spacing w:after="0"/>
+        <w:ind w:left="720"/>
+      </w:pPr>
+    </w:p>
+    <w:p>
+      <w:pPr>
+        <w:spacing w:after="0"/>
+      </w:pPr>
+      <w:r>
+        <w:t>Advantages of adopting  an SDLC model:</w:t>
+      </w:r>
+    </w:p>
+    <w:p>
+      <w:pPr>
+        <w:pStyle w:val="ListParagraph"/>
+        <w:numPr>
+          <w:ilvl w:val="0"/>
+          <w:numId w:val="47"/>
+        </w:numPr>
+        <w:spacing w:after="0"/>
+      </w:pPr>
+      <w:r>
+        <w:t>Improves software quality</w:t>
+      </w:r>
+    </w:p>
+    <w:p>
+      <w:pPr>
+        <w:pStyle w:val="ListParagraph"/>
+        <w:numPr>
+          <w:ilvl w:val="0"/>
+          <w:numId w:val="47"/>
+        </w:numPr>
+        <w:spacing w:after="0"/>
+      </w:pPr>
+      <w:r>
+        <w:t>Reduces project risk</w:t>
+      </w:r>
+    </w:p>
+    <w:p>
+      <w:pPr>
+        <w:pStyle w:val="ListParagraph"/>
+        <w:numPr>
+          <w:ilvl w:val="0"/>
+          <w:numId w:val="47"/>
+        </w:numPr>
+        <w:spacing w:after="0"/>
+      </w:pPr>
+      <w:r>
+        <w:t>Ensures clear communication</w:t>
+      </w:r>
+    </w:p>
+    <w:p>
+      <w:pPr>
+        <w:pStyle w:val="ListParagraph"/>
+        <w:numPr>
+          <w:ilvl w:val="0"/>
+          <w:numId w:val="47"/>
+        </w:numPr>
+        <w:spacing w:after="0"/>
+      </w:pPr>
+      <w:r>
         <w:lastRenderedPageBreak/>
-        <w:t>Project Plan and Schedule</w:t>
+        <w:t>Helps deliver projects on time and within budget</w:t>
+      </w:r>
+    </w:p>
+    <w:p>
+      <w:pPr>
+        <w:spacing w:after="0"/>
+      </w:pPr>
+    </w:p>
+    <w:p>
+      <w:pPr>
+        <w:pStyle w:val="Heading3"/>
+      </w:pPr>
+      <w:r>
+        <w:t>Waterfall model</w:t>
+      </w:r>
+    </w:p>
+    <w:p>
+      <w:pPr>
+        <w:spacing w:after="0"/>
+      </w:pPr>
+      <w:r>
+        <w:t>The Waterfall Model is the oldest and most traditional software development methodology that divides the software development process into distinct sequential ways, and each phase must be completed before moving to the next one. </w:t>
+      </w:r>
+    </w:p>
+    <w:p>
+      <w:pPr>
+        <w:spacing w:after="0"/>
+      </w:pPr>
+      <w:r>
+        <w:rPr>
+          <w:noProof/>
+        </w:rPr>
+        <w:drawing>
+          <wp:inline distT="0" distB="0" distL="0" distR="0" wp14:anchorId="58BA1AA5" wp14:editId="22D66BB2">
+            <wp:extent cx="3957523" cy="2597297"/>
+            <wp:effectExtent l="0" t="0" r="5080" b="0"/>
+            <wp:docPr id="1203350545" name="Picture 6" descr="waterfall model in software engineering lifecycle"/>
+            <wp:cNvGraphicFramePr>
+              <a:graphicFrameLocks xmlns:a="http://schemas.openxmlformats.org/drawingml/2006/main" noChangeAspect="1"/>
+            </wp:cNvGraphicFramePr>
+            <a:graphic xmlns:a="http://schemas.openxmlformats.org/drawingml/2006/main">
+              <a:graphicData uri="http://schemas.openxmlformats.org/drawingml/2006/picture">
+                <pic:pic xmlns:pic="http://schemas.openxmlformats.org/drawingml/2006/picture">
+                  <pic:nvPicPr>
+                    <pic:cNvPr id="0" name="Picture 16" descr="waterfall model in software engineering lifecycle"/>
+                    <pic:cNvPicPr>
+                      <a:picLocks noChangeAspect="1" noChangeArrowheads="1"/>
+                    </pic:cNvPicPr>
+                  </pic:nvPicPr>
+                  <pic:blipFill>
+                    <a:blip r:embed="rId18">
+                      <a:extLst>
+                        <a:ext uri="{28A0092B-C50C-407E-A947-70E740481C1C}">
+                          <a14:useLocalDpi xmlns:a14="http://schemas.microsoft.com/office/drawing/2010/main" val="0"/>
+                        </a:ext>
+                      </a:extLst>
+                    </a:blip>
+                    <a:srcRect/>
+                    <a:stretch>
+                      <a:fillRect/>
+                    </a:stretch>
+                  </pic:blipFill>
+                  <pic:spPr bwMode="auto">
+                    <a:xfrm>
+                      <a:off x="0" y="0"/>
+                      <a:ext cx="3980342" cy="2612273"/>
+                    </a:xfrm>
+                    <a:prstGeom prst="rect">
+                      <a:avLst/>
+                    </a:prstGeom>
+                    <a:noFill/>
+                    <a:ln>
+                      <a:noFill/>
+                    </a:ln>
+                  </pic:spPr>
+                </pic:pic>
+              </a:graphicData>
+            </a:graphic>
+          </wp:inline>
+        </w:drawing>
+      </w:r>
+    </w:p>
+    <w:p>
+      <w:pPr>
+        <w:spacing w:after="0"/>
+        <w:rPr>
+          <w:sz w:val="20"/>
+          <w:szCs w:val="20"/>
+        </w:rPr>
+      </w:pPr>
+      <w:r>
+        <w:rPr>
+          <w:sz w:val="20"/>
+          <w:szCs w:val="20"/>
+        </w:rPr>
+        <w:t>Fig 4.1.1.</w:t>
+      </w:r>
+      <w:r>
+        <w:rPr>
+          <w:sz w:val="20"/>
+          <w:szCs w:val="20"/>
+        </w:rPr>
+        <w:tab/>
+      </w:r>
+      <w:r>
+        <w:rPr>
+          <w:sz w:val="20"/>
+          <w:szCs w:val="20"/>
+        </w:rPr>
+        <w:tab/>
+      </w:r>
+      <w:r>
+        <w:rPr>
+          <w:sz w:val="20"/>
+          <w:szCs w:val="20"/>
+        </w:rPr>
+        <w:tab/>
+      </w:r>
+      <w:r>
+        <w:rPr>
+          <w:sz w:val="20"/>
+          <w:szCs w:val="20"/>
+        </w:rPr>
+        <w:tab/>
+      </w:r>
+      <w:r>
+        <w:rPr>
+          <w:sz w:val="20"/>
+          <w:szCs w:val="20"/>
+        </w:rPr>
+        <w:tab/>
+      </w:r>
+      <w:r>
+        <w:rPr>
+          <w:sz w:val="20"/>
+          <w:szCs w:val="20"/>
+        </w:rPr>
+        <w:t xml:space="preserve">Source: </w:t>
+      </w:r>
+      <w:hyperlink r:id="rId19" w:history="1">
+        <w:r>
+          <w:rPr>
+            <w:rStyle w:val="Hyperlink"/>
+            <w:sz w:val="20"/>
+            <w:szCs w:val="20"/>
+          </w:rPr>
+          <w:t>www.bdtask.com</w:t>
+        </w:r>
+      </w:hyperlink>
+    </w:p>
+    <w:p>
+      <w:pPr>
+        <w:spacing w:after="0"/>
+        <w:rPr>
+          <w:sz w:val="20"/>
+          <w:szCs w:val="20"/>
+        </w:rPr>
+      </w:pPr>
+    </w:p>
+    <w:p>
+      <w:pPr>
+        <w:pStyle w:val="Heading3"/>
+      </w:pPr>
+      <w:r>
+        <w:t>Agile model</w:t>
+      </w:r>
+    </w:p>
+    <w:p>
+      <w:pPr>
+        <w:spacing w:after="0"/>
+        <w:rPr>
+          <w:sz w:val="20"/>
+          <w:szCs w:val="20"/>
+        </w:rPr>
+      </w:pPr>
+      <w:r>
+        <w:rPr>
+          <w:sz w:val="20"/>
+          <w:szCs w:val="20"/>
+        </w:rPr>
+        <w:t>The Agile Software Development Life Cycle (SDLC) is an iterative and incremental </w:t>
+      </w:r>
+      <w:hyperlink r:id="rId20" w:tgtFrame="_blank" w:history="1">
+        <w:r>
+          <w:t>software development methodology</w:t>
+        </w:r>
+      </w:hyperlink>
+      <w:r>
+        <w:rPr>
+          <w:sz w:val="20"/>
+          <w:szCs w:val="20"/>
+        </w:rPr>
+        <w:t> that prioritizes flexibility, collaboration, and customer feedback. Unlike traditional SDLC models, such as the waterfall model, which completes each step sequentially, the agile SDLC divides the development process into smaller iterations or increments.</w:t>
+      </w:r>
+    </w:p>
+    <w:p>
+      <w:pPr>
+        <w:spacing w:after="0"/>
+      </w:pPr>
+    </w:p>
+    <w:p>
+      <w:pPr>
+        <w:spacing w:after="0"/>
+      </w:pPr>
+      <w:r>
+        <w:rPr>
+          <w:noProof/>
+        </w:rPr>
+        <w:drawing>
+          <wp:inline distT="0" distB="0" distL="0" distR="0" wp14:anchorId="527ECA19" wp14:editId="530C9831">
+            <wp:extent cx="3906317" cy="2790225"/>
+            <wp:effectExtent l="0" t="0" r="0" b="0"/>
+            <wp:docPr id="1310051792" name="Picture 4"/>
+            <wp:cNvGraphicFramePr>
+              <a:graphicFrameLocks xmlns:a="http://schemas.openxmlformats.org/drawingml/2006/main" noChangeAspect="1"/>
+            </wp:cNvGraphicFramePr>
+            <a:graphic xmlns:a="http://schemas.openxmlformats.org/drawingml/2006/main">
+              <a:graphicData uri="http://schemas.openxmlformats.org/drawingml/2006/picture">
+                <pic:pic xmlns:pic="http://schemas.openxmlformats.org/drawingml/2006/picture">
+                  <pic:nvPicPr>
+                    <pic:cNvPr id="0" name="Picture 2"/>
+                    <pic:cNvPicPr>
+                      <a:picLocks noChangeAspect="1" noChangeArrowheads="1"/>
+                    </pic:cNvPicPr>
+                  </pic:nvPicPr>
+                  <pic:blipFill>
+                    <a:blip r:embed="rId21" cstate="print">
+                      <a:extLst>
+                        <a:ext uri="{28A0092B-C50C-407E-A947-70E740481C1C}">
+                          <a14:useLocalDpi xmlns:a14="http://schemas.microsoft.com/office/drawing/2010/main" val="0"/>
+                        </a:ext>
+                      </a:extLst>
+                    </a:blip>
+                    <a:srcRect/>
+                    <a:stretch>
+                      <a:fillRect/>
+                    </a:stretch>
+                  </pic:blipFill>
+                  <pic:spPr bwMode="auto">
+                    <a:xfrm>
+                      <a:off x="0" y="0"/>
+                      <a:ext cx="3941317" cy="2815225"/>
+                    </a:xfrm>
+                    <a:prstGeom prst="rect">
+                      <a:avLst/>
+                    </a:prstGeom>
+                    <a:noFill/>
+                  </pic:spPr>
+                </pic:pic>
+              </a:graphicData>
+            </a:graphic>
+          </wp:inline>
+        </w:drawing>
+      </w:r>
+    </w:p>
+    <w:p>
+      <w:pPr>
+        <w:spacing w:after="0"/>
+        <w:rPr>
+          <w:sz w:val="20"/>
+          <w:szCs w:val="20"/>
+        </w:rPr>
+      </w:pPr>
+      <w:r>
+        <w:rPr>
+          <w:sz w:val="20"/>
+          <w:szCs w:val="20"/>
+        </w:rPr>
+        <w:t>Fig 4.1.2.</w:t>
+      </w:r>
+      <w:r>
+        <w:rPr>
+          <w:sz w:val="20"/>
+          <w:szCs w:val="20"/>
+        </w:rPr>
+        <w:tab/>
+      </w:r>
+      <w:r>
+        <w:rPr>
+          <w:sz w:val="20"/>
+          <w:szCs w:val="20"/>
+        </w:rPr>
+        <w:tab/>
+      </w:r>
+      <w:r>
+        <w:rPr>
+          <w:sz w:val="20"/>
+          <w:szCs w:val="20"/>
+        </w:rPr>
+        <w:tab/>
+      </w:r>
+      <w:r>
+        <w:rPr>
+          <w:sz w:val="20"/>
+          <w:szCs w:val="20"/>
+        </w:rPr>
+        <w:tab/>
+      </w:r>
+      <w:r>
+        <w:rPr>
+          <w:sz w:val="20"/>
+          <w:szCs w:val="20"/>
+        </w:rPr>
+        <w:t xml:space="preserve">Source: </w:t>
+      </w:r>
+      <w:hyperlink r:id="rId22" w:history="1">
+        <w:r>
+          <w:rPr>
+            <w:rStyle w:val="Hyperlink"/>
+            <w:sz w:val="20"/>
+            <w:szCs w:val="20"/>
+          </w:rPr>
+          <w:t>www.geeksforgeeks.org</w:t>
+        </w:r>
+      </w:hyperlink>
+    </w:p>
+    <w:p>
+      <w:pPr>
+        <w:spacing w:after="0"/>
+        <w:rPr>
+          <w:sz w:val="20"/>
+          <w:szCs w:val="20"/>
+        </w:rPr>
+      </w:pPr>
+    </w:p>
+    <w:p>
+      <w:pPr>
+        <w:pStyle w:val="Heading3"/>
+      </w:pPr>
+      <w:r>
+        <w:lastRenderedPageBreak/>
+        <w:t>Hybrid model</w:t>
+      </w:r>
+    </w:p>
+    <w:p>
+      <w:pPr>
+        <w:spacing w:after="0"/>
+        <w:rPr>
+          <w:sz w:val="20"/>
+          <w:szCs w:val="20"/>
+        </w:rPr>
+      </w:pPr>
+      <w:r>
+        <w:rPr>
+          <w:sz w:val="20"/>
+          <w:szCs w:val="20"/>
+        </w:rPr>
+        <w:t xml:space="preserve">During this project, continuous feedback was provided by the project supervisor and the professor responsible for the module. As soon as, a functional component of the project was designed and developed, feedback was given to improve the implementation so that the end product is customer-friendly and caters to the business requirement. </w:t>
+      </w:r>
+    </w:p>
+    <w:p>
+      <w:pPr>
+        <w:spacing w:after="0"/>
+        <w:rPr>
+          <w:sz w:val="20"/>
+          <w:szCs w:val="20"/>
+        </w:rPr>
+      </w:pPr>
+      <w:r>
+        <w:rPr>
+          <w:sz w:val="20"/>
+          <w:szCs w:val="20"/>
+        </w:rPr>
+        <w:t xml:space="preserve">Therefore, though the project was implemented in a traditional Waterfall approach, continuous feedback provided by the supervisor converted the model into a fusion of Agile and Waterfall approaches. </w:t>
+      </w:r>
+    </w:p>
+    <w:p>
+      <w:pPr>
+        <w:spacing w:after="0"/>
+        <w:rPr>
+          <w:sz w:val="20"/>
+          <w:szCs w:val="20"/>
+        </w:rPr>
+      </w:pPr>
+    </w:p>
+    <w:p>
+      <w:pPr>
+        <w:spacing w:after="0"/>
+        <w:rPr>
+          <w:sz w:val="20"/>
+          <w:szCs w:val="20"/>
+        </w:rPr>
+      </w:pPr>
+      <w:r>
+        <w:rPr>
+          <w:sz w:val="20"/>
+          <w:szCs w:val="20"/>
+        </w:rPr>
+        <w:t xml:space="preserve">Such hybrid models are most suitable models for projects with simple design, short duration and quick results. </w:t>
+      </w:r>
+    </w:p>
+    <w:p>
+      <w:pPr>
+        <w:spacing w:after="0"/>
+        <w:rPr>
+          <w:sz w:val="20"/>
+          <w:szCs w:val="20"/>
+        </w:rPr>
+      </w:pPr>
+    </w:p>
+    <w:p>
+      <w:pPr>
+        <w:pStyle w:val="Heading2"/>
+      </w:pPr>
+      <w:r>
+        <w:t>Project Schedule</w:t>
       </w:r>
     </w:p>
     <w:p>
@@ -6300,21 +7366,7 @@
                 <w:sz w:val="20"/>
                 <w:szCs w:val="20"/>
               </w:rPr>
-              <w:t xml:space="preserve">Develop Frontend for the Staff (for editing </w:t>
-            </w:r>
-            <w:r>
-              <w:rPr>
-                <w:sz w:val="20"/>
-                <w:szCs w:val="20"/>
-              </w:rPr>
-              <w:t>the available stock and the price of a dish).</w:t>
-            </w:r>
-            <w:r>
-              <w:rPr>
-                <w:sz w:val="20"/>
-                <w:szCs w:val="20"/>
-              </w:rPr>
-              <w:t xml:space="preserve"> ingredients (stock)).</w:t>
+              <w:t>Develop Frontend for the Staff (for editing the available stock and the price of a dish). ingredients (stock)).</w:t>
             </w:r>
           </w:p>
         </w:tc>
@@ -6963,6 +8015,13 @@
         </w:rPr>
         <w:t>Table 4.</w:t>
       </w:r>
+      <w:r>
+        <w:rPr>
+          <w:sz w:val="20"/>
+          <w:szCs w:val="20"/>
+        </w:rPr>
+        <w:t>2</w:t>
+      </w:r>
     </w:p>
     <w:p>
       <w:pPr>
@@ -6977,15 +8036,7 @@
         <w:t xml:space="preserve">Based on the above schedule, the following Gantt Chart shows the software tasks to be designed, developed and tested. </w:t>
       </w:r>
       <w:r>
-        <w:t xml:space="preserve">The schedule also </w:t>
-      </w:r>
-      <w:proofErr w:type="gramStart"/>
-      <w:r>
-        <w:t>takes into account</w:t>
-      </w:r>
-      <w:proofErr w:type="gramEnd"/>
-      <w:r>
-        <w:t xml:space="preserve"> the preparation for other modules/lessons to be learnt simultaneously. </w:t>
+        <w:t xml:space="preserve">The schedule also takes into account the preparation for other modules/lessons to be learnt simultaneously. </w:t>
       </w:r>
     </w:p>
     <w:p>
@@ -6995,9 +8046,13 @@
     </w:p>
     <w:p>
       <w:r>
+        <w:lastRenderedPageBreak/>
         <w:t xml:space="preserve"> </w:t>
       </w:r>
       <w:r>
+        <w:rPr>
+          <w:noProof/>
+        </w:rPr>
         <w:drawing>
           <wp:inline distT="0" distB="0" distL="0" distR="0" wp14:anchorId="01493B74" wp14:editId="3B42EF9E">
             <wp:extent cx="5731510" cy="728980"/>
@@ -7014,7 +8069,7 @@
                     <pic:cNvPicPr/>
                   </pic:nvPicPr>
                   <pic:blipFill>
-                    <a:blip r:embed="rId18"/>
+                    <a:blip r:embed="rId23"/>
                     <a:stretch>
                       <a:fillRect/>
                     </a:stretch>
@@ -7040,14 +8095,21 @@
         <w:jc w:val="right"/>
       </w:pPr>
       <w:r>
-        <w:t>Fig 4.1</w:t>
-      </w:r>
-    </w:p>
-    <w:p/>
-    <w:p/>
-    <w:p/>
-    <w:p>
-      <w:pPr>
+        <w:t>Fig 4.</w:t>
+      </w:r>
+      <w:r>
+        <w:t>3</w:t>
+      </w:r>
+    </w:p>
+    <w:p>
+      <w:r>
+        <w:br w:type="page"/>
+      </w:r>
+    </w:p>
+    <w:p>
+      <w:pPr>
+        <w:pStyle w:val="Heading1"/>
+        <w:ind w:left="432"/>
         <w:rPr>
           <w:b/>
           <w:bCs/>
@@ -7715,7 +8777,7 @@
       <w:r>
         <w:t xml:space="preserve">Emergence of Cloud Kitchen: </w:t>
       </w:r>
-      <w:hyperlink r:id="rId19" w:history="1">
+      <w:hyperlink r:id="rId24" w:history="1">
         <w:r>
           <w:rPr>
             <w:rStyle w:val="Hyperlink"/>
@@ -7741,7 +8803,7 @@
         <w:pStyle w:val="ListParagraph"/>
         <w:ind w:left="1440"/>
       </w:pPr>
-      <w:hyperlink r:id="rId20" w:history="1">
+      <w:hyperlink r:id="rId25" w:history="1">
         <w:r>
           <w:rPr>
             <w:rStyle w:val="Hyperlink"/>
@@ -7849,7 +8911,7 @@
     </w:p>
     <w:p/>
     <w:sectPr>
-      <w:headerReference w:type="first" r:id="rId21"/>
+      <w:headerReference w:type="first" r:id="rId26"/>
       <w:pgSz w:w="11906" w:h="16838"/>
       <w:pgMar w:top="1440" w:right="1440" w:bottom="1440" w:left="1440" w:header="708" w:footer="708" w:gutter="0"/>
       <w:pgBorders w:offsetFrom="page">
@@ -8379,6 +9441,92 @@
     </w:lvl>
   </w:abstractNum>
   <w:abstractNum w:abstractNumId="1" w15:restartNumberingAfterBreak="0">
+    <w:nsid w:val="0529139C"/>
+    <w:multiLevelType w:val="hybridMultilevel"/>
+    <w:tmpl w:val="E2127C9E"/>
+    <w:lvl w:ilvl="0" w:tplc="4C09000F">
+      <w:start w:val="1"/>
+      <w:numFmt w:val="decimal"/>
+      <w:lvlText w:val="%1."/>
+      <w:lvlJc w:val="left"/>
+      <w:pPr>
+        <w:ind w:left="720" w:hanging="360"/>
+      </w:pPr>
+    </w:lvl>
+    <w:lvl w:ilvl="1" w:tplc="4C090019" w:tentative="1">
+      <w:start w:val="1"/>
+      <w:numFmt w:val="lowerLetter"/>
+      <w:lvlText w:val="%2."/>
+      <w:lvlJc w:val="left"/>
+      <w:pPr>
+        <w:ind w:left="1440" w:hanging="360"/>
+      </w:pPr>
+    </w:lvl>
+    <w:lvl w:ilvl="2" w:tplc="4C09001B" w:tentative="1">
+      <w:start w:val="1"/>
+      <w:numFmt w:val="lowerRoman"/>
+      <w:lvlText w:val="%3."/>
+      <w:lvlJc w:val="right"/>
+      <w:pPr>
+        <w:ind w:left="2160" w:hanging="180"/>
+      </w:pPr>
+    </w:lvl>
+    <w:lvl w:ilvl="3" w:tplc="4C09000F" w:tentative="1">
+      <w:start w:val="1"/>
+      <w:numFmt w:val="decimal"/>
+      <w:lvlText w:val="%4."/>
+      <w:lvlJc w:val="left"/>
+      <w:pPr>
+        <w:ind w:left="2880" w:hanging="360"/>
+      </w:pPr>
+    </w:lvl>
+    <w:lvl w:ilvl="4" w:tplc="4C090019" w:tentative="1">
+      <w:start w:val="1"/>
+      <w:numFmt w:val="lowerLetter"/>
+      <w:lvlText w:val="%5."/>
+      <w:lvlJc w:val="left"/>
+      <w:pPr>
+        <w:ind w:left="3600" w:hanging="360"/>
+      </w:pPr>
+    </w:lvl>
+    <w:lvl w:ilvl="5" w:tplc="4C09001B" w:tentative="1">
+      <w:start w:val="1"/>
+      <w:numFmt w:val="lowerRoman"/>
+      <w:lvlText w:val="%6."/>
+      <w:lvlJc w:val="right"/>
+      <w:pPr>
+        <w:ind w:left="4320" w:hanging="180"/>
+      </w:pPr>
+    </w:lvl>
+    <w:lvl w:ilvl="6" w:tplc="4C09000F" w:tentative="1">
+      <w:start w:val="1"/>
+      <w:numFmt w:val="decimal"/>
+      <w:lvlText w:val="%7."/>
+      <w:lvlJc w:val="left"/>
+      <w:pPr>
+        <w:ind w:left="5040" w:hanging="360"/>
+      </w:pPr>
+    </w:lvl>
+    <w:lvl w:ilvl="7" w:tplc="4C090019" w:tentative="1">
+      <w:start w:val="1"/>
+      <w:numFmt w:val="lowerLetter"/>
+      <w:lvlText w:val="%8."/>
+      <w:lvlJc w:val="left"/>
+      <w:pPr>
+        <w:ind w:left="5760" w:hanging="360"/>
+      </w:pPr>
+    </w:lvl>
+    <w:lvl w:ilvl="8" w:tplc="4C09001B" w:tentative="1">
+      <w:start w:val="1"/>
+      <w:numFmt w:val="lowerRoman"/>
+      <w:lvlText w:val="%9."/>
+      <w:lvlJc w:val="right"/>
+      <w:pPr>
+        <w:ind w:left="6480" w:hanging="180"/>
+      </w:pPr>
+    </w:lvl>
+  </w:abstractNum>
+  <w:abstractNum w:abstractNumId="2" w15:restartNumberingAfterBreak="0">
     <w:nsid w:val="09331F9F"/>
     <w:multiLevelType w:val="hybridMultilevel"/>
     <w:tmpl w:val="A4086472"/>
@@ -8464,7 +9612,7 @@
       </w:pPr>
     </w:lvl>
   </w:abstractNum>
-  <w:abstractNum w:abstractNumId="2" w15:restartNumberingAfterBreak="0">
+  <w:abstractNum w:abstractNumId="3" w15:restartNumberingAfterBreak="0">
     <w:nsid w:val="112A390C"/>
     <w:multiLevelType w:val="hybridMultilevel"/>
     <w:tmpl w:val="8F563886"/>
@@ -8577,7 +9725,7 @@
       </w:rPr>
     </w:lvl>
   </w:abstractNum>
-  <w:abstractNum w:abstractNumId="3" w15:restartNumberingAfterBreak="0">
+  <w:abstractNum w:abstractNumId="4" w15:restartNumberingAfterBreak="0">
     <w:nsid w:val="12BA181F"/>
     <w:multiLevelType w:val="multilevel"/>
     <w:tmpl w:val="4266CDE6"/>
@@ -8726,7 +9874,7 @@
       </w:rPr>
     </w:lvl>
   </w:abstractNum>
-  <w:abstractNum w:abstractNumId="4" w15:restartNumberingAfterBreak="0">
+  <w:abstractNum w:abstractNumId="5" w15:restartNumberingAfterBreak="0">
     <w:nsid w:val="160E4175"/>
     <w:multiLevelType w:val="multilevel"/>
     <w:tmpl w:val="AFE8C394"/>
@@ -8875,7 +10023,7 @@
       </w:rPr>
     </w:lvl>
   </w:abstractNum>
-  <w:abstractNum w:abstractNumId="5" w15:restartNumberingAfterBreak="0">
+  <w:abstractNum w:abstractNumId="6" w15:restartNumberingAfterBreak="0">
     <w:nsid w:val="22722DF7"/>
     <w:multiLevelType w:val="multilevel"/>
     <w:tmpl w:val="18FE3BC6"/>
@@ -9020,7 +10168,7 @@
       </w:rPr>
     </w:lvl>
   </w:abstractNum>
-  <w:abstractNum w:abstractNumId="6" w15:restartNumberingAfterBreak="0">
+  <w:abstractNum w:abstractNumId="7" w15:restartNumberingAfterBreak="0">
     <w:nsid w:val="236F2064"/>
     <w:multiLevelType w:val="multilevel"/>
     <w:tmpl w:val="CE8C75A4"/>
@@ -9169,7 +10317,7 @@
       </w:rPr>
     </w:lvl>
   </w:abstractNum>
-  <w:abstractNum w:abstractNumId="7" w15:restartNumberingAfterBreak="0">
+  <w:abstractNum w:abstractNumId="8" w15:restartNumberingAfterBreak="0">
     <w:nsid w:val="25013D8F"/>
     <w:multiLevelType w:val="multilevel"/>
     <w:tmpl w:val="CCF42E7A"/>
@@ -9318,7 +10466,7 @@
       </w:rPr>
     </w:lvl>
   </w:abstractNum>
-  <w:abstractNum w:abstractNumId="8" w15:restartNumberingAfterBreak="0">
+  <w:abstractNum w:abstractNumId="9" w15:restartNumberingAfterBreak="0">
     <w:nsid w:val="25613B51"/>
     <w:multiLevelType w:val="hybridMultilevel"/>
     <w:tmpl w:val="906046B2"/>
@@ -9431,7 +10579,7 @@
       </w:rPr>
     </w:lvl>
   </w:abstractNum>
-  <w:abstractNum w:abstractNumId="9" w15:restartNumberingAfterBreak="0">
+  <w:abstractNum w:abstractNumId="10" w15:restartNumberingAfterBreak="0">
     <w:nsid w:val="34155274"/>
     <w:multiLevelType w:val="multilevel"/>
     <w:tmpl w:val="F17E11D2"/>
@@ -9580,7 +10728,7 @@
       </w:rPr>
     </w:lvl>
   </w:abstractNum>
-  <w:abstractNum w:abstractNumId="10" w15:restartNumberingAfterBreak="0">
+  <w:abstractNum w:abstractNumId="11" w15:restartNumberingAfterBreak="0">
     <w:nsid w:val="34166DF4"/>
     <w:multiLevelType w:val="multilevel"/>
     <w:tmpl w:val="F224FB04"/>
@@ -9729,7 +10877,7 @@
       </w:rPr>
     </w:lvl>
   </w:abstractNum>
-  <w:abstractNum w:abstractNumId="11" w15:restartNumberingAfterBreak="0">
+  <w:abstractNum w:abstractNumId="12" w15:restartNumberingAfterBreak="0">
     <w:nsid w:val="341F379D"/>
     <w:multiLevelType w:val="multilevel"/>
     <w:tmpl w:val="87044CF6"/>
@@ -9878,7 +11026,7 @@
       </w:rPr>
     </w:lvl>
   </w:abstractNum>
-  <w:abstractNum w:abstractNumId="12" w15:restartNumberingAfterBreak="0">
+  <w:abstractNum w:abstractNumId="13" w15:restartNumberingAfterBreak="0">
     <w:nsid w:val="35AF285B"/>
     <w:multiLevelType w:val="multilevel"/>
     <w:tmpl w:val="A830E936"/>
@@ -10027,7 +11175,7 @@
       </w:rPr>
     </w:lvl>
   </w:abstractNum>
-  <w:abstractNum w:abstractNumId="13" w15:restartNumberingAfterBreak="0">
+  <w:abstractNum w:abstractNumId="14" w15:restartNumberingAfterBreak="0">
     <w:nsid w:val="368310CA"/>
     <w:multiLevelType w:val="hybridMultilevel"/>
     <w:tmpl w:val="6EAAE3A4"/>
@@ -10140,7 +11288,7 @@
       </w:rPr>
     </w:lvl>
   </w:abstractNum>
-  <w:abstractNum w:abstractNumId="14" w15:restartNumberingAfterBreak="0">
+  <w:abstractNum w:abstractNumId="15" w15:restartNumberingAfterBreak="0">
     <w:nsid w:val="37A450BB"/>
     <w:multiLevelType w:val="hybridMultilevel"/>
     <w:tmpl w:val="CD54B780"/>
@@ -10226,7 +11374,7 @@
       </w:pPr>
     </w:lvl>
   </w:abstractNum>
-  <w:abstractNum w:abstractNumId="15" w15:restartNumberingAfterBreak="0">
+  <w:abstractNum w:abstractNumId="16" w15:restartNumberingAfterBreak="0">
     <w:nsid w:val="39D323A2"/>
     <w:multiLevelType w:val="hybridMultilevel"/>
     <w:tmpl w:val="8486B30A"/>
@@ -10339,7 +11487,7 @@
       </w:rPr>
     </w:lvl>
   </w:abstractNum>
-  <w:abstractNum w:abstractNumId="16" w15:restartNumberingAfterBreak="0">
+  <w:abstractNum w:abstractNumId="17" w15:restartNumberingAfterBreak="0">
     <w:nsid w:val="3B126C36"/>
     <w:multiLevelType w:val="multilevel"/>
     <w:tmpl w:val="32B6BFCA"/>
@@ -10488,7 +11636,7 @@
       </w:rPr>
     </w:lvl>
   </w:abstractNum>
-  <w:abstractNum w:abstractNumId="17" w15:restartNumberingAfterBreak="0">
+  <w:abstractNum w:abstractNumId="18" w15:restartNumberingAfterBreak="0">
     <w:nsid w:val="3FB42C9B"/>
     <w:multiLevelType w:val="hybridMultilevel"/>
     <w:tmpl w:val="C92882A8"/>
@@ -10601,7 +11749,7 @@
       </w:rPr>
     </w:lvl>
   </w:abstractNum>
-  <w:abstractNum w:abstractNumId="18" w15:restartNumberingAfterBreak="0">
+  <w:abstractNum w:abstractNumId="19" w15:restartNumberingAfterBreak="0">
     <w:nsid w:val="40937B0C"/>
     <w:multiLevelType w:val="multilevel"/>
     <w:tmpl w:val="A11885CA"/>
@@ -10750,7 +11898,7 @@
       </w:rPr>
     </w:lvl>
   </w:abstractNum>
-  <w:abstractNum w:abstractNumId="19" w15:restartNumberingAfterBreak="0">
+  <w:abstractNum w:abstractNumId="20" w15:restartNumberingAfterBreak="0">
     <w:nsid w:val="417E421D"/>
     <w:multiLevelType w:val="hybridMultilevel"/>
     <w:tmpl w:val="362EDA48"/>
@@ -10863,7 +12011,7 @@
       </w:rPr>
     </w:lvl>
   </w:abstractNum>
-  <w:abstractNum w:abstractNumId="20" w15:restartNumberingAfterBreak="0">
+  <w:abstractNum w:abstractNumId="21" w15:restartNumberingAfterBreak="0">
     <w:nsid w:val="46270533"/>
     <w:multiLevelType w:val="multilevel"/>
     <w:tmpl w:val="276A700A"/>
@@ -11012,7 +12160,7 @@
       </w:rPr>
     </w:lvl>
   </w:abstractNum>
-  <w:abstractNum w:abstractNumId="21" w15:restartNumberingAfterBreak="0">
+  <w:abstractNum w:abstractNumId="22" w15:restartNumberingAfterBreak="0">
     <w:nsid w:val="4B985486"/>
     <w:multiLevelType w:val="multilevel"/>
     <w:tmpl w:val="9E98C9F6"/>
@@ -11161,7 +12309,7 @@
       </w:rPr>
     </w:lvl>
   </w:abstractNum>
-  <w:abstractNum w:abstractNumId="22" w15:restartNumberingAfterBreak="0">
+  <w:abstractNum w:abstractNumId="23" w15:restartNumberingAfterBreak="0">
     <w:nsid w:val="4B9E2726"/>
     <w:multiLevelType w:val="hybridMultilevel"/>
     <w:tmpl w:val="349476CA"/>
@@ -11247,7 +12395,7 @@
       </w:pPr>
     </w:lvl>
   </w:abstractNum>
-  <w:abstractNum w:abstractNumId="23" w15:restartNumberingAfterBreak="0">
+  <w:abstractNum w:abstractNumId="24" w15:restartNumberingAfterBreak="0">
     <w:nsid w:val="4C5779AC"/>
     <w:multiLevelType w:val="hybridMultilevel"/>
     <w:tmpl w:val="FD3687D4"/>
@@ -11333,7 +12481,7 @@
       </w:pPr>
     </w:lvl>
   </w:abstractNum>
-  <w:abstractNum w:abstractNumId="24" w15:restartNumberingAfterBreak="0">
+  <w:abstractNum w:abstractNumId="25" w15:restartNumberingAfterBreak="0">
     <w:nsid w:val="4CAD5D6D"/>
     <w:multiLevelType w:val="hybridMultilevel"/>
     <w:tmpl w:val="1452F2C6"/>
@@ -11425,7 +12573,7 @@
       </w:pPr>
     </w:lvl>
   </w:abstractNum>
-  <w:abstractNum w:abstractNumId="25" w15:restartNumberingAfterBreak="0">
+  <w:abstractNum w:abstractNumId="26" w15:restartNumberingAfterBreak="0">
     <w:nsid w:val="528F78B4"/>
     <w:multiLevelType w:val="hybridMultilevel"/>
     <w:tmpl w:val="A79CA45A"/>
@@ -11538,7 +12686,7 @@
       </w:rPr>
     </w:lvl>
   </w:abstractNum>
-  <w:abstractNum w:abstractNumId="26" w15:restartNumberingAfterBreak="0">
+  <w:abstractNum w:abstractNumId="27" w15:restartNumberingAfterBreak="0">
     <w:nsid w:val="52E1514F"/>
     <w:multiLevelType w:val="hybridMultilevel"/>
     <w:tmpl w:val="F20A0362"/>
@@ -11651,7 +12799,7 @@
       </w:rPr>
     </w:lvl>
   </w:abstractNum>
-  <w:abstractNum w:abstractNumId="27" w15:restartNumberingAfterBreak="0">
+  <w:abstractNum w:abstractNumId="28" w15:restartNumberingAfterBreak="0">
     <w:nsid w:val="53023CA0"/>
     <w:multiLevelType w:val="hybridMultilevel"/>
     <w:tmpl w:val="325AED00"/>
@@ -11764,7 +12912,7 @@
       </w:rPr>
     </w:lvl>
   </w:abstractNum>
-  <w:abstractNum w:abstractNumId="28" w15:restartNumberingAfterBreak="0">
+  <w:abstractNum w:abstractNumId="29" w15:restartNumberingAfterBreak="0">
     <w:nsid w:val="5C3A6EE6"/>
     <w:multiLevelType w:val="hybridMultilevel"/>
     <w:tmpl w:val="5A36499E"/>
@@ -11877,10 +13025,10 @@
       </w:rPr>
     </w:lvl>
   </w:abstractNum>
-  <w:abstractNum w:abstractNumId="29" w15:restartNumberingAfterBreak="0">
+  <w:abstractNum w:abstractNumId="30" w15:restartNumberingAfterBreak="0">
     <w:nsid w:val="5D217595"/>
     <w:multiLevelType w:val="hybridMultilevel"/>
-    <w:tmpl w:val="80E66436"/>
+    <w:tmpl w:val="8020EE34"/>
     <w:lvl w:ilvl="0" w:tplc="4C090001">
       <w:start w:val="1"/>
       <w:numFmt w:val="bullet"/>
@@ -11990,7 +13138,7 @@
       </w:rPr>
     </w:lvl>
   </w:abstractNum>
-  <w:abstractNum w:abstractNumId="30" w15:restartNumberingAfterBreak="0">
+  <w:abstractNum w:abstractNumId="31" w15:restartNumberingAfterBreak="0">
     <w:nsid w:val="5E5B07CB"/>
     <w:multiLevelType w:val="hybridMultilevel"/>
     <w:tmpl w:val="5078727E"/>
@@ -12103,7 +13251,7 @@
       </w:rPr>
     </w:lvl>
   </w:abstractNum>
-  <w:abstractNum w:abstractNumId="31" w15:restartNumberingAfterBreak="0">
+  <w:abstractNum w:abstractNumId="32" w15:restartNumberingAfterBreak="0">
     <w:nsid w:val="5FCD0F14"/>
     <w:multiLevelType w:val="multilevel"/>
     <w:tmpl w:val="5F968818"/>
@@ -12252,7 +13400,7 @@
       </w:rPr>
     </w:lvl>
   </w:abstractNum>
-  <w:abstractNum w:abstractNumId="32" w15:restartNumberingAfterBreak="0">
+  <w:abstractNum w:abstractNumId="33" w15:restartNumberingAfterBreak="0">
     <w:nsid w:val="69720419"/>
     <w:multiLevelType w:val="hybridMultilevel"/>
     <w:tmpl w:val="AE94D4D6"/>
@@ -12365,7 +13513,7 @@
       </w:rPr>
     </w:lvl>
   </w:abstractNum>
-  <w:abstractNum w:abstractNumId="33" w15:restartNumberingAfterBreak="0">
+  <w:abstractNum w:abstractNumId="34" w15:restartNumberingAfterBreak="0">
     <w:nsid w:val="6F81741B"/>
     <w:multiLevelType w:val="hybridMultilevel"/>
     <w:tmpl w:val="1F627E1E"/>
@@ -12451,7 +13599,7 @@
       </w:pPr>
     </w:lvl>
   </w:abstractNum>
-  <w:abstractNum w:abstractNumId="34" w15:restartNumberingAfterBreak="0">
+  <w:abstractNum w:abstractNumId="35" w15:restartNumberingAfterBreak="0">
     <w:nsid w:val="70CC038E"/>
     <w:multiLevelType w:val="hybridMultilevel"/>
     <w:tmpl w:val="2B56120C"/>
@@ -12564,7 +13712,7 @@
       </w:rPr>
     </w:lvl>
   </w:abstractNum>
-  <w:abstractNum w:abstractNumId="35" w15:restartNumberingAfterBreak="0">
+  <w:abstractNum w:abstractNumId="36" w15:restartNumberingAfterBreak="0">
     <w:nsid w:val="744D00EA"/>
     <w:multiLevelType w:val="hybridMultilevel"/>
     <w:tmpl w:val="46FA5BD6"/>
@@ -12653,7 +13801,7 @@
       </w:pPr>
     </w:lvl>
   </w:abstractNum>
-  <w:abstractNum w:abstractNumId="36" w15:restartNumberingAfterBreak="0">
+  <w:abstractNum w:abstractNumId="37" w15:restartNumberingAfterBreak="0">
     <w:nsid w:val="77055AEA"/>
     <w:multiLevelType w:val="multilevel"/>
     <w:tmpl w:val="4C090025"/>
@@ -12674,7 +13822,7 @@
       <w:lvlText w:val="%1.%2"/>
       <w:lvlJc w:val="left"/>
       <w:pPr>
-        <w:ind w:left="576" w:hanging="576"/>
+        <w:ind w:left="1001" w:hanging="576"/>
       </w:pPr>
     </w:lvl>
     <w:lvl w:ilvl="2">
@@ -12748,7 +13896,7 @@
       </w:pPr>
     </w:lvl>
   </w:abstractNum>
-  <w:abstractNum w:abstractNumId="37" w15:restartNumberingAfterBreak="0">
+  <w:abstractNum w:abstractNumId="38" w15:restartNumberingAfterBreak="0">
     <w:nsid w:val="793E0576"/>
     <w:multiLevelType w:val="hybridMultilevel"/>
     <w:tmpl w:val="F13E629C"/>
@@ -12834,7 +13982,7 @@
       </w:pPr>
     </w:lvl>
   </w:abstractNum>
-  <w:abstractNum w:abstractNumId="38" w15:restartNumberingAfterBreak="0">
+  <w:abstractNum w:abstractNumId="39" w15:restartNumberingAfterBreak="0">
     <w:nsid w:val="7D880CD1"/>
     <w:multiLevelType w:val="hybridMultilevel"/>
     <w:tmpl w:val="774E55B4"/>
@@ -12924,151 +14072,160 @@
     </w:lvl>
   </w:abstractNum>
   <w:num w:numId="1" w16cid:durableId="2101023550">
+    <w:abstractNumId w:val="35"/>
+  </w:num>
+  <w:num w:numId="2" w16cid:durableId="221209614">
+    <w:abstractNumId w:val="15"/>
+  </w:num>
+  <w:num w:numId="3" w16cid:durableId="135221646">
+    <w:abstractNumId w:val="33"/>
+  </w:num>
+  <w:num w:numId="4" w16cid:durableId="1172834399">
+    <w:abstractNumId w:val="26"/>
+  </w:num>
+  <w:num w:numId="5" w16cid:durableId="503513150">
     <w:abstractNumId w:val="34"/>
   </w:num>
-  <w:num w:numId="2" w16cid:durableId="221209614">
-    <w:abstractNumId w:val="14"/>
+  <w:num w:numId="6" w16cid:durableId="371197934">
+    <w:abstractNumId w:val="25"/>
   </w:num>
-  <w:num w:numId="3" w16cid:durableId="135221646">
+  <w:num w:numId="7" w16cid:durableId="1718159051">
+    <w:abstractNumId w:val="29"/>
+  </w:num>
+  <w:num w:numId="8" w16cid:durableId="1277709455">
+    <w:abstractNumId w:val="27"/>
+  </w:num>
+  <w:num w:numId="9" w16cid:durableId="1508978951">
+    <w:abstractNumId w:val="9"/>
+  </w:num>
+  <w:num w:numId="10" w16cid:durableId="890262165">
+    <w:abstractNumId w:val="31"/>
+  </w:num>
+  <w:num w:numId="11" w16cid:durableId="1291210351">
+    <w:abstractNumId w:val="18"/>
+  </w:num>
+  <w:num w:numId="12" w16cid:durableId="842158887">
+    <w:abstractNumId w:val="16"/>
+  </w:num>
+  <w:num w:numId="13" w16cid:durableId="652829571">
+    <w:abstractNumId w:val="13"/>
+  </w:num>
+  <w:num w:numId="14" w16cid:durableId="256980594">
+    <w:abstractNumId w:val="19"/>
+  </w:num>
+  <w:num w:numId="15" w16cid:durableId="863901878">
+    <w:abstractNumId w:val="4"/>
+  </w:num>
+  <w:num w:numId="16" w16cid:durableId="1809282207">
+    <w:abstractNumId w:val="12"/>
+  </w:num>
+  <w:num w:numId="17" w16cid:durableId="514147943">
+    <w:abstractNumId w:val="17"/>
+  </w:num>
+  <w:num w:numId="18" w16cid:durableId="1012955528">
+    <w:abstractNumId w:val="5"/>
+  </w:num>
+  <w:num w:numId="19" w16cid:durableId="770668482">
+    <w:abstractNumId w:val="11"/>
+  </w:num>
+  <w:num w:numId="20" w16cid:durableId="1153762675">
+    <w:abstractNumId w:val="7"/>
+  </w:num>
+  <w:num w:numId="21" w16cid:durableId="1061095796">
+    <w:abstractNumId w:val="22"/>
+  </w:num>
+  <w:num w:numId="22" w16cid:durableId="911814019">
     <w:abstractNumId w:val="32"/>
   </w:num>
-  <w:num w:numId="4" w16cid:durableId="1172834399">
-    <w:abstractNumId w:val="25"/>
+  <w:num w:numId="23" w16cid:durableId="944003616">
+    <w:abstractNumId w:val="6"/>
   </w:num>
-  <w:num w:numId="5" w16cid:durableId="503513150">
-    <w:abstractNumId w:val="33"/>
+  <w:num w:numId="24" w16cid:durableId="1475101237">
+    <w:abstractNumId w:val="21"/>
   </w:num>
-  <w:num w:numId="6" w16cid:durableId="371197934">
-    <w:abstractNumId w:val="24"/>
+  <w:num w:numId="25" w16cid:durableId="1171985516">
+    <w:abstractNumId w:val="36"/>
   </w:num>
-  <w:num w:numId="7" w16cid:durableId="1718159051">
-    <w:abstractNumId w:val="28"/>
-  </w:num>
-  <w:num w:numId="8" w16cid:durableId="1277709455">
-    <w:abstractNumId w:val="26"/>
-  </w:num>
-  <w:num w:numId="9" w16cid:durableId="1508978951">
+  <w:num w:numId="26" w16cid:durableId="769931498">
     <w:abstractNumId w:val="8"/>
   </w:num>
-  <w:num w:numId="10" w16cid:durableId="890262165">
-    <w:abstractNumId w:val="30"/>
-  </w:num>
-  <w:num w:numId="11" w16cid:durableId="1291210351">
-    <w:abstractNumId w:val="17"/>
-  </w:num>
-  <w:num w:numId="12" w16cid:durableId="842158887">
-    <w:abstractNumId w:val="15"/>
-  </w:num>
-  <w:num w:numId="13" w16cid:durableId="652829571">
-    <w:abstractNumId w:val="12"/>
-  </w:num>
-  <w:num w:numId="14" w16cid:durableId="256980594">
-    <w:abstractNumId w:val="18"/>
-  </w:num>
-  <w:num w:numId="15" w16cid:durableId="863901878">
-    <w:abstractNumId w:val="3"/>
-  </w:num>
-  <w:num w:numId="16" w16cid:durableId="1809282207">
-    <w:abstractNumId w:val="11"/>
-  </w:num>
-  <w:num w:numId="17" w16cid:durableId="514147943">
-    <w:abstractNumId w:val="16"/>
-  </w:num>
-  <w:num w:numId="18" w16cid:durableId="1012955528">
-    <w:abstractNumId w:val="4"/>
-  </w:num>
-  <w:num w:numId="19" w16cid:durableId="770668482">
+  <w:num w:numId="27" w16cid:durableId="375354219">
     <w:abstractNumId w:val="10"/>
-  </w:num>
-  <w:num w:numId="20" w16cid:durableId="1153762675">
-    <w:abstractNumId w:val="6"/>
-  </w:num>
-  <w:num w:numId="21" w16cid:durableId="1061095796">
-    <w:abstractNumId w:val="21"/>
-  </w:num>
-  <w:num w:numId="22" w16cid:durableId="911814019">
-    <w:abstractNumId w:val="31"/>
-  </w:num>
-  <w:num w:numId="23" w16cid:durableId="944003616">
-    <w:abstractNumId w:val="5"/>
-  </w:num>
-  <w:num w:numId="24" w16cid:durableId="1475101237">
-    <w:abstractNumId w:val="20"/>
-  </w:num>
-  <w:num w:numId="25" w16cid:durableId="1171985516">
-    <w:abstractNumId w:val="35"/>
-  </w:num>
-  <w:num w:numId="26" w16cid:durableId="769931498">
-    <w:abstractNumId w:val="7"/>
-  </w:num>
-  <w:num w:numId="27" w16cid:durableId="375354219">
-    <w:abstractNumId w:val="9"/>
   </w:num>
   <w:num w:numId="28" w16cid:durableId="1672945005">
     <w:abstractNumId w:val="0"/>
   </w:num>
   <w:num w:numId="29" w16cid:durableId="865797033">
+    <w:abstractNumId w:val="2"/>
+  </w:num>
+  <w:num w:numId="30" w16cid:durableId="1233345203">
+    <w:abstractNumId w:val="24"/>
+  </w:num>
+  <w:num w:numId="31" w16cid:durableId="1324354791">
+    <w:abstractNumId w:val="14"/>
+  </w:num>
+  <w:num w:numId="32" w16cid:durableId="647980856">
+    <w:abstractNumId w:val="39"/>
+  </w:num>
+  <w:num w:numId="33" w16cid:durableId="572012300">
+    <w:abstractNumId w:val="38"/>
+  </w:num>
+  <w:num w:numId="34" w16cid:durableId="841359410">
+    <w:abstractNumId w:val="23"/>
+  </w:num>
+  <w:num w:numId="35" w16cid:durableId="1490901197">
+    <w:abstractNumId w:val="37"/>
+  </w:num>
+  <w:num w:numId="36" w16cid:durableId="1041176087">
+    <w:abstractNumId w:val="37"/>
+  </w:num>
+  <w:num w:numId="37" w16cid:durableId="1805655981">
+    <w:abstractNumId w:val="37"/>
+  </w:num>
+  <w:num w:numId="38" w16cid:durableId="430585273">
+    <w:abstractNumId w:val="37"/>
+  </w:num>
+  <w:num w:numId="39" w16cid:durableId="49311406">
+    <w:abstractNumId w:val="37"/>
+  </w:num>
+  <w:num w:numId="40" w16cid:durableId="466437298">
+    <w:abstractNumId w:val="37"/>
+  </w:num>
+  <w:num w:numId="41" w16cid:durableId="531646379">
+    <w:abstractNumId w:val="37"/>
+  </w:num>
+  <w:num w:numId="42" w16cid:durableId="822620113">
+    <w:abstractNumId w:val="37"/>
+  </w:num>
+  <w:num w:numId="43" w16cid:durableId="1035079744">
+    <w:abstractNumId w:val="3"/>
+  </w:num>
+  <w:num w:numId="44" w16cid:durableId="655188481">
+    <w:abstractNumId w:val="37"/>
+  </w:num>
+  <w:num w:numId="45" w16cid:durableId="1885629562">
+    <w:abstractNumId w:val="20"/>
+  </w:num>
+  <w:num w:numId="46" w16cid:durableId="1528325879">
+    <w:abstractNumId w:val="28"/>
+  </w:num>
+  <w:num w:numId="47" w16cid:durableId="959527955">
+    <w:abstractNumId w:val="30"/>
+  </w:num>
+  <w:num w:numId="48" w16cid:durableId="1189485415">
+    <w:abstractNumId w:val="37"/>
+  </w:num>
+  <w:num w:numId="49" w16cid:durableId="436220317">
+    <w:abstractNumId w:val="37"/>
+  </w:num>
+  <w:num w:numId="50" w16cid:durableId="63455917">
+    <w:abstractNumId w:val="37"/>
+  </w:num>
+  <w:num w:numId="51" w16cid:durableId="131680257">
     <w:abstractNumId w:val="1"/>
   </w:num>
-  <w:num w:numId="30" w16cid:durableId="1233345203">
-    <w:abstractNumId w:val="23"/>
-  </w:num>
-  <w:num w:numId="31" w16cid:durableId="1324354791">
-    <w:abstractNumId w:val="13"/>
-  </w:num>
-  <w:num w:numId="32" w16cid:durableId="647980856">
-    <w:abstractNumId w:val="38"/>
-  </w:num>
-  <w:num w:numId="33" w16cid:durableId="572012300">
+  <w:num w:numId="52" w16cid:durableId="358163711">
     <w:abstractNumId w:val="37"/>
-  </w:num>
-  <w:num w:numId="34" w16cid:durableId="841359410">
-    <w:abstractNumId w:val="22"/>
-  </w:num>
-  <w:num w:numId="35" w16cid:durableId="1490901197">
-    <w:abstractNumId w:val="36"/>
-  </w:num>
-  <w:num w:numId="36" w16cid:durableId="1041176087">
-    <w:abstractNumId w:val="36"/>
-  </w:num>
-  <w:num w:numId="37" w16cid:durableId="1805655981">
-    <w:abstractNumId w:val="36"/>
-  </w:num>
-  <w:num w:numId="38" w16cid:durableId="430585273">
-    <w:abstractNumId w:val="36"/>
-  </w:num>
-  <w:num w:numId="39" w16cid:durableId="49311406">
-    <w:abstractNumId w:val="36"/>
-  </w:num>
-  <w:num w:numId="40" w16cid:durableId="466437298">
-    <w:abstractNumId w:val="36"/>
-  </w:num>
-  <w:num w:numId="41" w16cid:durableId="531646379">
-    <w:abstractNumId w:val="36"/>
-  </w:num>
-  <w:num w:numId="42" w16cid:durableId="822620113">
-    <w:abstractNumId w:val="36"/>
-  </w:num>
-  <w:num w:numId="43" w16cid:durableId="1035079744">
-    <w:abstractNumId w:val="2"/>
-  </w:num>
-  <w:num w:numId="44" w16cid:durableId="655188481">
-    <w:abstractNumId w:val="36"/>
-  </w:num>
-  <w:num w:numId="45" w16cid:durableId="1885629562">
-    <w:abstractNumId w:val="19"/>
-  </w:num>
-  <w:num w:numId="46" w16cid:durableId="1528325879">
-    <w:abstractNumId w:val="27"/>
-  </w:num>
-  <w:num w:numId="47" w16cid:durableId="959527955">
-    <w:abstractNumId w:val="29"/>
-  </w:num>
-  <w:num w:numId="48" w16cid:durableId="1189485415">
-    <w:abstractNumId w:val="36"/>
-  </w:num>
-  <w:num w:numId="49" w16cid:durableId="436220317">
-    <w:abstractNumId w:val="36"/>
   </w:num>
 </w:numbering>
 </file>
@@ -13529,7 +14686,6 @@
     <w:next w:val="Normal"/>
     <w:link w:val="Heading3Char"/>
     <w:uiPriority w:val="9"/>
-    <w:semiHidden/>
     <w:unhideWhenUsed/>
     <w:qFormat/>
     <w:rsid w:val="00617607"/>
@@ -13776,7 +14932,6 @@
     <w:basedOn w:val="DefaultParagraphFont"/>
     <w:link w:val="Heading3"/>
     <w:uiPriority w:val="9"/>
-    <w:semiHidden/>
     <w:rsid w:val="00617607"/>
     <w:rPr>
       <w:rFonts w:asciiTheme="majorHAnsi" w:eastAsiaTheme="majorEastAsia" w:hAnsiTheme="majorHAnsi" w:cstheme="majorBidi"/>

</xml_diff>